<commit_message>
Finalizing annual model! Timeblock on SE in 2025 resolved a lot of issues and truncating B0_H a little bit led to full convergence (0.9996 at 1.1).
</commit_message>
<xml_diff>
--- a/markdown/RFsportmort_Report_EDITING.docx
+++ b/markdown/RFsportmort_Report_EDITING.docx
@@ -2349,7 +2349,15 @@
         <w:pStyle w:val="FirstParagraph"/>
       </w:pPr>
       <w:r>
-        <w:t xml:space="preserve">Estimating total removals from the population includes accounting for the number of fish that are expected to die after release. Release mortality estimates prior to 2013, the year DRM devices were mandated, assume that all fish were released on the surface and apply published mortality estimates (Hannah et al. 2008; Hochhalter et al. 2011; Hannah et a. 2012; Hochhalter et al. 2012) for pelagic and non-pelagic species (Figure RELEASE MORT). DRM became mandatory gear for charter vessels in 2013 and have been required for all fishing vessels (private or charterd) since </w:t>
+        <w:t xml:space="preserve">Estimating total removals from the population includes accounting for the number of fish that are expected to die after release. Release mortality estimates prior to 2013, the year DRM devices were mandated, assume that all fish were released on the surface and apply published mortality estimates (Hannah et al. 2008; Hochhalter et al. 2011; Hannah et a. 2012; Hochhalter et al. 2012) for pelagic and non-pelagic species (Figure </w:t>
+      </w:r>
+      <w:ins w:id="16" w:author="Joy, Philip J (DFG)" w:date="2026-10-12T10:00:00Z" w16du:dateUtc="2026-10-12T18:00:00Z">
+        <w:r>
+          <w:t xml:space="preserve">7 </w:t>
+        </w:r>
+      </w:ins>
+      <w:r>
+        <w:t xml:space="preserve">RELEASE MORT). DRM became mandatory gear for charter vessels in 2013 and have been required for all fishing vessels (private or charterd) since </w:t>
       </w:r>
       <w:r>
         <w:lastRenderedPageBreak/>
@@ -2361,7 +2369,15 @@
         <w:pStyle w:val="BodyText"/>
       </w:pPr>
       <w:r>
-        <w:t>Southeast mortality rates do not account for the depth of released fish, but assume a phased in effect of the DRM devices for private users reflecting the adoption of the devices between the mandate for charter vessels in 2013 and the mandate for all vessels in 2020 (Figure RELEASE MORT). Sport fish mortality rates are estimated from preliminary research conducted by commercial fisheries (unpublished data and Hannah et al. 2008; Jarvis and Lowe 2008; Hochhalter and Reed 2011; Hochhalter et al. 2011; Hannah et a. 2012; Hochhalter et al. 2012; Blain and Sutton 2016; Blain-Roth and Sutton 2019).</w:t>
+        <w:t xml:space="preserve">Southeast mortality rates do not account for the depth of released fish, but assume a phased in effect of the DRM devices for private users reflecting the adoption of the devices between the mandate for charter vessels in 2013 and the mandate for all vessels in 2020 (Figure </w:t>
+      </w:r>
+      <w:ins w:id="17" w:author="Joy, Philip J (DFG)" w:date="2026-10-12T10:01:00Z" w16du:dateUtc="2026-10-12T18:01:00Z">
+        <w:r>
+          <w:t xml:space="preserve">7 </w:t>
+        </w:r>
+      </w:ins>
+      <w:r>
+        <w:t>RELEASE MORT). Sport fish mortality rates are estimated from preliminary research conducted by commercial fisheries (unpublished data and Hannah et al. 2008; Jarvis and Lowe 2008; Hochhalter and Reed 2011; Hochhalter et al. 2011; Hannah et a. 2012; Hochhalter et al. 2012; Blain and Sutton 2016; Blain-Roth and Sutton 2019).</w:t>
       </w:r>
     </w:p>
     <w:p>
@@ -2376,7 +2392,7 @@
       <w:pPr>
         <w:pStyle w:val="Heading4"/>
       </w:pPr>
-      <w:bookmarkStart w:id="16" w:name="weight-data-and-estimates"/>
+      <w:bookmarkStart w:id="18" w:name="weight-data-and-estimates"/>
       <w:bookmarkEnd w:id="15"/>
       <w:r>
         <w:t>Weight Data and Estimates</w:t>
@@ -2528,25 +2544,59 @@
       <w:r>
         <w:t xml:space="preserve">Sampling in Southeast Alaska is not proportional to the distribution of the catch and as such uses a 4-stage weighted average procedure to estimate mean weights (Richards et al. 2025). The 4-stage approach is detailed in Richards et al. (2025) but as of this writing historical weight estimates prior to </w:t>
       </w:r>
-      <w:r>
-        <w:rPr>
-          <w:b/>
-          <w:bCs/>
-        </w:rPr>
-        <w:t>20XX</w:t>
-      </w:r>
-      <w:r>
-        <w:t xml:space="preserve"> are being reevaluated and are unavailable. As such weight estimates prior to </w:t>
-      </w:r>
-      <w:r>
-        <w:rPr>
-          <w:b/>
-          <w:bCs/>
-        </w:rPr>
-        <w:t>20XX</w:t>
-      </w:r>
-      <w:r>
-        <w:t xml:space="preserve"> use bootstrapped mean weights similar to Southcentral methods but are to be considered </w:t>
+      <w:del w:id="19" w:author="Joy, Philip J (DFG)" w:date="2026-10-12T08:47:00Z" w16du:dateUtc="2026-10-12T16:47:00Z">
+        <w:r>
+          <w:rPr>
+            <w:b/>
+            <w:bCs/>
+          </w:rPr>
+          <w:delText>20XX</w:delText>
+        </w:r>
+        <w:r>
+          <w:delText xml:space="preserve"> </w:delText>
+        </w:r>
+      </w:del>
+      <w:ins w:id="20" w:author="Joy, Philip J (DFG)" w:date="2026-10-12T08:47:00Z" w16du:dateUtc="2026-10-12T16:47:00Z">
+        <w:r>
+          <w:rPr>
+            <w:b/>
+            <w:bCs/>
+          </w:rPr>
+          <w:t>2025</w:t>
+        </w:r>
+        <w:r>
+          <w:t xml:space="preserve"> </w:t>
+        </w:r>
+      </w:ins>
+      <w:r>
+        <w:t xml:space="preserve">are being reevaluated and are unavailable. As such weight estimates prior to </w:t>
+      </w:r>
+      <w:del w:id="21" w:author="Joy, Philip J (DFG)" w:date="2026-10-12T08:47:00Z" w16du:dateUtc="2026-10-12T16:47:00Z">
+        <w:r>
+          <w:rPr>
+            <w:b/>
+            <w:bCs/>
+          </w:rPr>
+          <w:delText>20XX</w:delText>
+        </w:r>
+        <w:r>
+          <w:delText xml:space="preserve"> </w:delText>
+        </w:r>
+      </w:del>
+      <w:ins w:id="22" w:author="Joy, Philip J (DFG)" w:date="2026-10-12T08:47:00Z" w16du:dateUtc="2026-10-12T16:47:00Z">
+        <w:r>
+          <w:rPr>
+            <w:b/>
+            <w:bCs/>
+          </w:rPr>
+          <w:t>2025</w:t>
+        </w:r>
+        <w:r>
+          <w:t xml:space="preserve"> </w:t>
+        </w:r>
+      </w:ins>
+      <w:r>
+        <w:t xml:space="preserve">use bootstrapped mean weights similar to Southcentral methods but are to be considered </w:t>
       </w:r>
       <w:r>
         <w:rPr>
@@ -2558,13 +2608,26 @@
       <w:r>
         <w:t xml:space="preserve"> estimates that will be revised as needed. Updated weight estimates will be important for accuracy but are expected to result in only minor differences in biomass estimates that should not significantly impact stock assessments.</w:t>
       </w:r>
+      <w:ins w:id="23" w:author="Joy, Philip J (DFG)" w:date="2026-10-12T08:48:00Z" w16du:dateUtc="2026-10-12T16:48:00Z">
+        <w:r>
+          <w:t xml:space="preserve"> This report provides removal estimates in numbers as well as biomass and</w:t>
+        </w:r>
+        <w:r>
+          <w:t xml:space="preserve"> up</w:t>
+        </w:r>
+      </w:ins>
+      <w:ins w:id="24" w:author="Joy, Philip J (DFG)" w:date="2026-10-12T08:49:00Z" w16du:dateUtc="2026-10-12T16:49:00Z">
+        <w:r>
+          <w:t>dated weight estimates for past years can easily be applied to the posterior estimates from the model.</w:t>
+        </w:r>
+      </w:ins>
     </w:p>
     <w:p>
       <w:pPr>
         <w:pStyle w:val="Heading4"/>
       </w:pPr>
-      <w:bookmarkStart w:id="17" w:name="kodiak-stereoscopic-camera-data"/>
-      <w:bookmarkEnd w:id="16"/>
+      <w:bookmarkStart w:id="25" w:name="kodiak-stereoscopic-camera-data"/>
+      <w:bookmarkEnd w:id="18"/>
       <w:r>
         <w:t>Kodiak Stereoscopic Camera Data</w:t>
       </w:r>
@@ -2581,8 +2644,8 @@
       <w:pPr>
         <w:pStyle w:val="Heading3"/>
       </w:pPr>
-      <w:bookmarkStart w:id="18" w:name="model-structure"/>
-      <w:bookmarkEnd w:id="17"/>
+      <w:bookmarkStart w:id="26" w:name="model-structure"/>
+      <w:bookmarkEnd w:id="25"/>
       <w:r>
         <w:t>Model Structure</w:t>
       </w:r>
@@ -2594,30 +2657,32 @@
       <w:r>
         <w:t>The model is constructed over two time periods that are divided into the historical reconstruction between 1977 and 2019, and modern estimates which begin in 2020. The historical reconstruction relies on hindcasting estimates of the species composition and the retention probability by species in the periods before port sampling programs and logbook programs were available to provide those estimates. Doing so required relying on long term means when the data revealed no temporal trends or, alternatively, logistic curves to account for trends in the data when trends were evident. Management action taken by the department was relatively light prior to 2020 and harvest and release trends can be assumed to follow a mostly organic process as these fisheries developed over time. Beginning in 2020 the department began taking stronger management actions to curtail rockfish harvests, including fishery closures and more severe bag limit reductions (Arthur et al 2024; Blain-Roth et al. 2024; Polum et al. 2025). These regulatory changes altered angler behavior with regard to retention probabilities and species composition of the harvest and thus behavior during the modern period would not be informative to angler behavior in the past. While the process remains consistent throughout the entire time series, long term means and logistic extrapolations in the hindcasting process rely only on data through 2019.</w:t>
       </w:r>
+      <w:ins w:id="27" w:author="Joy, Philip J (DFG)" w:date="2026-10-12T08:21:00Z" w16du:dateUtc="2026-10-12T16:21:00Z">
+        <w:r>
+          <w:t xml:space="preserve"> </w:t>
+        </w:r>
+      </w:ins>
     </w:p>
     <w:p>
       <w:pPr>
         <w:pStyle w:val="Heading2"/>
       </w:pPr>
-      <w:bookmarkStart w:id="19" w:name="_Toc242361791"/>
-      <w:bookmarkStart w:id="20" w:name="process-equations"/>
+      <w:bookmarkStart w:id="28" w:name="_Toc242361791"/>
+      <w:bookmarkStart w:id="29" w:name="process-equations"/>
       <w:bookmarkEnd w:id="11"/>
-      <w:bookmarkEnd w:id="18"/>
-      <w:r>
+      <w:bookmarkEnd w:id="26"/>
+      <w:r>
+        <w:lastRenderedPageBreak/>
         <w:t>Process equations</w:t>
       </w:r>
-      <w:bookmarkEnd w:id="19"/>
+      <w:bookmarkEnd w:id="28"/>
     </w:p>
     <w:p>
       <w:pPr>
         <w:pStyle w:val="FirstParagraph"/>
       </w:pPr>
       <w:r>
-        <w:t xml:space="preserve">The model process is based around the guided logbook and SWHS estimates of total rockfish harvest by year and CFMU. Guided and unguided harvests are proportionally related to total </w:t>
-      </w:r>
-      <w:r>
-        <w:lastRenderedPageBreak/>
-        <w:t>harvests (</w:t>
+        <w:t>The model process is based around the guided logbook and SWHS estimates of total rockfish harvest by year and CFMU. Guided and unguided harvests are proportionally related to total harvests (</w:t>
       </w:r>
       <m:oMath>
         <m:sSub>
@@ -2694,7 +2759,7 @@
       <w:pPr>
         <w:pStyle w:val="Heading3"/>
       </w:pPr>
-      <w:bookmarkStart w:id="21" w:name="harvests"/>
+      <w:bookmarkStart w:id="30" w:name="harvests"/>
       <w:r>
         <w:t>Harvests</w:t>
       </w:r>
@@ -3603,8 +3668,8 @@
       <w:pPr>
         <w:pStyle w:val="Heading3"/>
       </w:pPr>
-      <w:bookmarkStart w:id="22" w:name="species-apportionment"/>
-      <w:bookmarkEnd w:id="21"/>
+      <w:bookmarkStart w:id="31" w:name="species-apportionment"/>
+      <w:bookmarkEnd w:id="30"/>
       <w:r>
         <w:t>Species Apportionment</w:t>
       </w:r>
@@ -4257,7 +4322,6 @@
         <w:pStyle w:val="BodyText"/>
       </w:pPr>
       <w:r>
-        <w:lastRenderedPageBreak/>
         <w:t xml:space="preserve">where </w:t>
       </w:r>
       <m:oMath>
@@ -5654,6 +5718,9 @@
     <w:p>
       <w:pPr>
         <w:pStyle w:val="BodyText"/>
+        <w:rPr>
+          <w:ins w:id="32" w:author="Joy, Philip J (DFG)" w:date="2026-10-12T08:22:00Z" w16du:dateUtc="2026-10-12T16:22:00Z"/>
+        </w:rPr>
       </w:pPr>
       <w:r>
         <w:t xml:space="preserve">where the </w:t>
@@ -5798,6 +5865,51 @@
       <w:r>
         <w:t xml:space="preserve"> is a random effect describing the deviation from the mean.</w:t>
       </w:r>
+      <w:ins w:id="33" w:author="Joy, Philip J (DFG)" w:date="2026-10-12T08:22:00Z" w16du:dateUtc="2026-10-12T16:22:00Z">
+        <w:r>
+          <w:t xml:space="preserve"> </w:t>
+        </w:r>
+      </w:ins>
+    </w:p>
+    <w:p>
+      <w:pPr>
+        <w:pStyle w:val="BodyText"/>
+      </w:pPr>
+      <w:ins w:id="34" w:author="Joy, Philip J (DFG)" w:date="2026-10-12T08:22:00Z" w16du:dateUtc="2026-10-12T16:22:00Z">
+        <w:r>
+          <w:t xml:space="preserve">Note that the underlying means described by the B0compa parameter </w:t>
+        </w:r>
+      </w:ins>
+      <w:ins w:id="35" w:author="Joy, Philip J (DFG)" w:date="2026-10-12T08:23:00Z" w16du:dateUtc="2026-10-12T16:23:00Z">
+        <w:r>
+          <w:t xml:space="preserve">may </w:t>
+        </w:r>
+      </w:ins>
+      <w:ins w:id="36" w:author="Joy, Philip J (DFG)" w:date="2026-10-12T08:24:00Z" w16du:dateUtc="2026-10-12T16:24:00Z">
+        <w:r>
+          <w:t>require a time-block approach when there are ma</w:t>
+        </w:r>
+      </w:ins>
+      <w:ins w:id="37" w:author="Joy, Philip J (DFG)" w:date="2026-10-12T08:25:00Z" w16du:dateUtc="2026-10-12T16:25:00Z">
+        <w:r>
+          <w:t>jor shifts in management as was the case in Southeast Alaska in 2025. Between 2020 and 2024 Southeast Alaska was closed to the retention of yelloweye rockfish for both guided and unguided anglers but opened again in 2025</w:t>
+        </w:r>
+      </w:ins>
+      <w:ins w:id="38" w:author="Joy, Philip J (DFG)" w:date="2026-10-12T08:26:00Z" w16du:dateUtc="2026-10-12T16:26:00Z">
+        <w:r>
+          <w:t>. This closure has obvious and large effects on the species composition, including the ratio of pelagic:non-pelagic rockfish</w:t>
+        </w:r>
+      </w:ins>
+      <w:ins w:id="39" w:author="Joy, Philip J (DFG)" w:date="2026-10-12T08:27:00Z" w16du:dateUtc="2026-10-12T16:27:00Z">
+        <w:r>
+          <w:t xml:space="preserve"> and, withing the non-pelagic group, between slope and non-yelloweye DSR. As such the B0compa parameter for Southeas</w:t>
+        </w:r>
+      </w:ins>
+      <w:ins w:id="40" w:author="Joy, Philip J (DFG)" w:date="2026-10-12T08:28:00Z" w16du:dateUtc="2026-10-12T16:28:00Z">
+        <w:r>
+          <w:t>t Alaska encompasses the years between 2020 and 2024 as a time block and then a separate parameter estimates a new mean beginning in 2025.</w:t>
+        </w:r>
+      </w:ins>
     </w:p>
     <w:p>
       <w:pPr>
@@ -5864,6 +5976,7 @@
             <m:rPr>
               <m:nor/>
             </m:rPr>
+            <w:lastRenderedPageBreak/>
             <m:t>logit</m:t>
           </m:r>
           <m:d>
@@ -6523,7 +6636,6 @@
         <w:pStyle w:val="BodyText"/>
       </w:pPr>
       <w:r>
-        <w:lastRenderedPageBreak/>
         <w:t xml:space="preserve">The regional </w:t>
       </w:r>
       <m:oMath>
@@ -8215,12 +8327,28 @@
         </m:sSub>
       </m:oMath>
       <w:r>
-        <w:t xml:space="preserve">), which varied by region (Figure DATA). The second period consisted of the data informed time series through 2019. The third period consisted of 2020 through the present. It was necessary to divide the time series in this manner to ensure that the fit curves were forced through the data. The recent time period was separated to stay consistent with the rest of the model and ensure that the recent period that included management measures did not affect hindcasting. The pre-2020 </w:t>
-      </w:r>
-      <w:r>
-        <w:lastRenderedPageBreak/>
-        <w:t>period necessitated separating the random effects between the periods with and without data to prevent the model from fitting a line that resulted in all of the random effects in the data period being positive or negative and balanced out by the reverse estimates in the pre-data period.</w:t>
-      </w:r>
+        <w:t>), which varied by region (Figure DATA). The second period consisted of the data informed time series through 2019. The third period consisted of 2020 through the present. It was necessary to divide the time series in this manner to ensure that the fit curves were forced through the data. The recent time period was separated to stay consistent with the rest of the model and ensure that the recent period that included management measures did not affect hindcasting. The pre-2020 period necessitated separating the random effects between the periods with and without data to prevent the model from fitting a line that resulted in all of the random effects in the data period being positive or negative and balanced out by the reverse estimates in the pre-data period.</w:t>
+      </w:r>
+      <w:ins w:id="41" w:author="Joy, Philip J (DFG)" w:date="2026-10-12T08:35:00Z" w16du:dateUtc="2026-10-12T16:35:00Z">
+        <w:r>
+          <w:t xml:space="preserve"> Note that the </w:t>
+        </w:r>
+      </w:ins>
+      <w:ins w:id="42" w:author="Joy, Philip J (DFG)" w:date="2026-10-12T08:36:00Z" w16du:dateUtc="2026-10-12T16:36:00Z">
+        <w:r>
+          <w:t xml:space="preserve">time-blocking that is used for the  </w:t>
+        </w:r>
+      </w:ins>
+      <w:ins w:id="43" w:author="Joy, Philip J (DFG)" w:date="2026-10-12T08:37:00Z" w16du:dateUtc="2026-10-12T16:37:00Z">
+        <w:r>
+          <w:t>B0compa parameter to address the change in management in Southeast Alaska in 2025 carries forth to the random effects as well. Thus for Southeast Alaska, the third period extends from 2020 through 2024 with a fo</w:t>
+        </w:r>
+      </w:ins>
+      <w:ins w:id="44" w:author="Joy, Philip J (DFG)" w:date="2026-10-12T08:38:00Z" w16du:dateUtc="2026-10-12T16:38:00Z">
+        <w:r>
+          <w:t>urth period beginning in 2025.</w:t>
+        </w:r>
+      </w:ins>
     </w:p>
     <w:p>
       <w:pPr>
@@ -9270,8 +9398,8 @@
       <w:pPr>
         <w:pStyle w:val="Heading3"/>
       </w:pPr>
-      <w:bookmarkStart w:id="23" w:name="releases"/>
-      <w:bookmarkEnd w:id="22"/>
+      <w:bookmarkStart w:id="45" w:name="releases"/>
+      <w:bookmarkEnd w:id="31"/>
       <w:r>
         <w:t>Releases</w:t>
       </w:r>
@@ -9281,7 +9409,27 @@
         <w:pStyle w:val="FirstParagraph"/>
       </w:pPr>
       <w:r>
-        <w:t xml:space="preserve">The procedure for estimating releases differs from the Howard methods in that it relies on a process driven approach in contrast to the estimation methods employed in Howard et al. (2020; Figure 7 REL_SCHEMATICS) and further incorporates all sources of data, including SWHS estimates and port sampling interview data. Rather than making the assumption that the guided:unguided ratio of total rockfish releases in the SWHS data is an appropriate way to derive unguided releases of each species complex from the logbook record of releases, this approach models releases based on the harvests and the probability that a landed fish is retained separately for each of the regional species assemblages while estimating and accounting for the bias in SWHS release estimates. Thus, the true number of released rockfish </w:t>
+        <w:t xml:space="preserve">The procedure for estimating releases differs from the Howard methods in that it relies on a process driven approach in contrast to the estimation methods employed in Howard et al. (2020; Figure </w:t>
+      </w:r>
+      <w:del w:id="46" w:author="Joy, Philip J (DFG)" w:date="2026-10-12T10:02:00Z" w16du:dateUtc="2026-10-12T18:02:00Z">
+        <w:r>
+          <w:delText xml:space="preserve">7 </w:delText>
+        </w:r>
+      </w:del>
+      <w:ins w:id="47" w:author="Joy, Philip J (DFG)" w:date="2026-10-12T10:02:00Z" w16du:dateUtc="2026-10-12T18:02:00Z">
+        <w:r>
+          <w:t>8</w:t>
+        </w:r>
+        <w:r>
+          <w:t xml:space="preserve"> </w:t>
+        </w:r>
+      </w:ins>
+      <w:r>
+        <w:t xml:space="preserve">REL_SCHEMATICS) and further incorporates all sources of data, including SWHS estimates </w:t>
+      </w:r>
+      <w:r>
+        <w:lastRenderedPageBreak/>
+        <w:t xml:space="preserve">and port sampling interview data. Rather than making the assumption that the guided:unguided ratio of total rockfish releases in the SWHS data is an appropriate way to derive unguided releases of each species complex from the logbook record of releases, this approach models releases based on the harvests and the probability that a landed fish is retained separately for each of the regional species assemblages while estimating and accounting for the bias in SWHS release estimates. Thus, the true number of released rockfish </w:t>
       </w:r>
       <m:oMath>
         <m:sSub>
@@ -9425,11 +9573,7 @@
         </m:sSub>
       </m:oMath>
       <w:r>
-        <w:t xml:space="preserve"> and release estimates are only calculated for those categories. It was </w:t>
-      </w:r>
-      <w:r>
-        <w:lastRenderedPageBreak/>
-        <w:t xml:space="preserve">assumed that </w:t>
+        <w:t xml:space="preserve"> and release estimates are only calculated for those categories. It was assumed that </w:t>
       </w:r>
       <m:oMath>
         <m:r>
@@ -10630,6 +10774,9 @@
     <w:p>
       <w:pPr>
         <w:pStyle w:val="BodyText"/>
+        <w:rPr>
+          <w:ins w:id="48" w:author="Joy, Philip J (DFG)" w:date="2026-10-12T08:29:00Z" w16du:dateUtc="2026-10-12T16:29:00Z"/>
+        </w:rPr>
       </w:pPr>
       <w:r>
         <w:t xml:space="preserve">where the </w:t>
@@ -10779,7 +10926,58 @@
       <w:pPr>
         <w:pStyle w:val="BodyText"/>
       </w:pPr>
-      <w:r>
+      <w:ins w:id="49" w:author="Joy, Philip J (DFG)" w:date="2026-10-12T08:30:00Z" w16du:dateUtc="2026-10-12T16:30:00Z">
+        <w:r>
+          <w:t xml:space="preserve">A time block approach is also necessary to deal with the B4pHcompa parameter for the same reasons it </w:t>
+        </w:r>
+      </w:ins>
+      <w:ins w:id="50" w:author="Joy, Philip J (DFG)" w:date="2026-10-12T08:31:00Z" w16du:dateUtc="2026-10-12T16:31:00Z">
+        <w:r>
+          <w:t xml:space="preserve">was necessary for the </w:t>
+        </w:r>
+      </w:ins>
+      <w:ins w:id="51" w:author="Joy, Philip J (DFG)" w:date="2026-10-12T08:29:00Z" w16du:dateUtc="2026-10-12T16:29:00Z">
+        <w:r>
+          <w:t xml:space="preserve">B0compa parameter </w:t>
+        </w:r>
+      </w:ins>
+      <w:ins w:id="52" w:author="Joy, Philip J (DFG)" w:date="2026-10-12T08:31:00Z" w16du:dateUtc="2026-10-12T16:31:00Z">
+        <w:r>
+          <w:t>described above. Because Southeast Alask</w:t>
+        </w:r>
+      </w:ins>
+      <w:ins w:id="53" w:author="Joy, Philip J (DFG)" w:date="2026-10-12T08:32:00Z" w16du:dateUtc="2026-10-12T16:32:00Z">
+        <w:r>
+          <w:t>a was closed to the retention of yelloweye rockfish between 2020 and 2024 the probability of retaining a yelloweye rockfish would be substantially different from when they were reopened to a</w:t>
+        </w:r>
+      </w:ins>
+      <w:ins w:id="54" w:author="Joy, Philip J (DFG)" w:date="2026-10-12T08:33:00Z" w16du:dateUtc="2026-10-12T16:33:00Z">
+        <w:r>
+          <w:t xml:space="preserve"> limited harvest in 2025. This has the knock-on effect of potentially altering angler behavior with regard to other rockfish species as well. </w:t>
+        </w:r>
+      </w:ins>
+      <w:ins w:id="55" w:author="Joy, Philip J (DFG)" w:date="2026-10-12T08:29:00Z" w16du:dateUtc="2026-10-12T16:29:00Z">
+        <w:r>
+          <w:t xml:space="preserve">As such the </w:t>
+        </w:r>
+      </w:ins>
+      <w:ins w:id="56" w:author="Joy, Philip J (DFG)" w:date="2026-10-12T08:33:00Z" w16du:dateUtc="2026-10-12T16:33:00Z">
+        <w:r>
+          <w:t xml:space="preserve">B4pHcompa </w:t>
+        </w:r>
+      </w:ins>
+      <w:ins w:id="57" w:author="Joy, Philip J (DFG)" w:date="2026-10-12T08:29:00Z" w16du:dateUtc="2026-10-12T16:29:00Z">
+        <w:r>
+          <w:t>parameter for Southeast Alaska encompasses the years between 2020 and 2024 as a time block and then a separate parameter estimates a new mean beginning in 2025.</w:t>
+        </w:r>
+      </w:ins>
+    </w:p>
+    <w:p>
+      <w:pPr>
+        <w:pStyle w:val="BodyText"/>
+      </w:pPr>
+      <w:r>
+        <w:lastRenderedPageBreak/>
         <w:t xml:space="preserve">For this historical reconstruction prior to 2020, the proportion harvest parameters for </w:t>
       </w:r>
       <m:oMath>
@@ -11771,7 +11969,6 @@
         <w:pStyle w:val="BodyText"/>
       </w:pPr>
       <w:r>
-        <w:lastRenderedPageBreak/>
         <w:t xml:space="preserve">Unlike the compositional trends, </w:t>
       </w:r>
       <w:r>
@@ -13463,7 +13660,11 @@
         </m:r>
       </m:oMath>
       <w:r>
-        <w:t xml:space="preserve"> (inflection point) was fixed to an arbitrary value so that equation </w:t>
+        <w:t xml:space="preserve"> (inflection </w:t>
+      </w:r>
+      <w:r>
+        <w:lastRenderedPageBreak/>
+        <w:t xml:space="preserve">point) was fixed to an arbitrary value so that equation </w:t>
       </w:r>
       <w:r>
         <w:rPr>
@@ -13581,7 +13782,20 @@
         <w:t>pH</w:t>
       </w:r>
       <w:r>
-        <w:t>. Because the proportion harvested is known for guided anglers via logbook data, the difference in the proportion harvested for each user group in the SWHS data suggests whether private anglers are more or less likely to retain a generic rockfish relative to guided anglers. The same relationship was used in the Howard methods to estimate unguided releases whereas this approach treats it as a prior that interacts with all other relevant data sources to provide a more data and process driven estimate of releases (Figure 7).</w:t>
+        <w:t xml:space="preserve">. Because the proportion harvested is known for guided anglers via logbook data, the difference in the proportion harvested for each user group in the SWHS data suggests whether private anglers are more or less likely to retain a generic rockfish relative to guided anglers. The same relationship was used in the Howard methods to estimate unguided releases whereas this approach treats it as a prior that interacts with all other relevant data sources to provide a more data and process driven estimate of releases (Figure </w:t>
+      </w:r>
+      <w:del w:id="58" w:author="Joy, Philip J (DFG)" w:date="2026-10-12T10:02:00Z" w16du:dateUtc="2026-10-12T18:02:00Z">
+        <w:r>
+          <w:delText>7</w:delText>
+        </w:r>
+      </w:del>
+      <w:ins w:id="59" w:author="Joy, Philip J (DFG)" w:date="2026-10-12T10:02:00Z" w16du:dateUtc="2026-10-12T18:02:00Z">
+        <w:r>
+          <w:t>8</w:t>
+        </w:r>
+      </w:ins>
+      <w:r>
+        <w:t>).</w:t>
       </w:r>
     </w:p>
     <w:p>
@@ -13919,7 +14133,6 @@
             <w:rPr>
               <w:rFonts w:ascii="Cambria Math" w:hAnsi="Cambria Math"/>
             </w:rPr>
-            <w:lastRenderedPageBreak/>
             <m:t>p</m:t>
           </m:r>
           <m:sSubSup>
@@ -15828,6 +16041,7 @@
             <m:rPr>
               <m:nor/>
             </m:rPr>
+            <w:lastRenderedPageBreak/>
             <m:t>log</m:t>
           </m:r>
           <m:d>
@@ -16392,17 +16606,22 @@
       <w:r>
         <w:t>These priors were weakly informative given the large variances associated with SWHS release estimates and propagation of that uncertainty through the derivation of the priors</w:t>
       </w:r>
-      <w:ins w:id="24" w:author="Joy, Philip J (DFG)" w:date="2026-10-08T14:51:00Z" w16du:dateUtc="2026-10-08T22:51:00Z">
+      <w:ins w:id="60" w:author="Joy, Philip J (DFG)" w:date="2026-10-08T14:51:00Z" w16du:dateUtc="2026-10-08T22:51:00Z">
         <w:r>
           <w:t xml:space="preserve"> (</w:t>
         </w:r>
       </w:ins>
-      <w:ins w:id="25" w:author="Joy, Philip J (DFG)" w:date="2026-10-08T15:14:00Z" w16du:dateUtc="2026-10-08T23:14:00Z">
+      <w:ins w:id="61" w:author="Joy, Philip J (DFG)" w:date="2026-10-08T15:14:00Z" w16du:dateUtc="2026-10-08T23:14:00Z">
         <w:r>
-          <w:t>FIGURE 8</w:t>
+          <w:t xml:space="preserve">FIGURE </w:t>
         </w:r>
       </w:ins>
-      <w:ins w:id="26" w:author="Joy, Philip J (DFG)" w:date="2026-10-08T14:51:00Z" w16du:dateUtc="2026-10-08T22:51:00Z">
+      <w:ins w:id="62" w:author="Joy, Philip J (DFG)" w:date="2026-10-12T10:02:00Z" w16du:dateUtc="2026-10-12T18:02:00Z">
+        <w:r>
+          <w:t>9</w:t>
+        </w:r>
+      </w:ins>
+      <w:ins w:id="63" w:author="Joy, Philip J (DFG)" w:date="2026-10-08T14:51:00Z" w16du:dateUtc="2026-10-08T22:51:00Z">
         <w:r>
           <w:t xml:space="preserve"> pH Priors)</w:t>
         </w:r>
@@ -16425,8 +16644,8 @@
       <w:pPr>
         <w:pStyle w:val="Heading3"/>
       </w:pPr>
-      <w:bookmarkStart w:id="27" w:name="total-mortality"/>
-      <w:bookmarkEnd w:id="23"/>
+      <w:bookmarkStart w:id="64" w:name="total-mortality"/>
+      <w:bookmarkEnd w:id="45"/>
       <w:r>
         <w:t>Total mortality</w:t>
       </w:r>
@@ -16436,11 +16655,23 @@
         <w:pStyle w:val="FirstParagraph"/>
       </w:pPr>
       <w:r>
-        <w:t xml:space="preserve">Release mortality (i.e., the number of released rockfish expected to die) was calculated assuming fixed mortality rates developed in each of the regions (FIGURE 8 REL_MORT). Deep-water release mechanism (DRM) devices were mandated for charter fleets in 2013 and release mortality rates were reduced since then to match research results (Jarvis and Lowe 2008; Hochhalter and </w:t>
-      </w:r>
-      <w:r>
-        <w:lastRenderedPageBreak/>
-        <w:t>Reed 2011; Blain and Sutton 2016; Blain-Roth and Sutton 2019). Southeast applies basic rates estimated in these studies while Southcentral and Kodiak rates were derived by using historical depth-of-release data to adjust the rates based on area and user group.</w:t>
+        <w:t xml:space="preserve">Release mortality (i.e., the number of released rockfish expected to die) was calculated assuming fixed mortality rates developed in each of the regions (FIGURE </w:t>
+      </w:r>
+      <w:del w:id="65" w:author="Joy, Philip J (DFG)" w:date="2026-10-12T10:03:00Z" w16du:dateUtc="2026-10-12T18:03:00Z">
+        <w:r>
+          <w:delText xml:space="preserve">8 </w:delText>
+        </w:r>
+      </w:del>
+      <w:ins w:id="66" w:author="Joy, Philip J (DFG)" w:date="2026-10-12T10:03:00Z" w16du:dateUtc="2026-10-12T18:03:00Z">
+        <w:r>
+          <w:t>7</w:t>
+        </w:r>
+        <w:r>
+          <w:t xml:space="preserve"> </w:t>
+        </w:r>
+      </w:ins>
+      <w:r>
+        <w:t>REL_MORT). Deep-water release mechanism (DRM) devices were mandated for charter fleets in 2013 and release mortality rates were reduced since then to match research results (Jarvis and Lowe 2008; Hochhalter and Reed 2011; Blain and Sutton 2016; Blain-Roth and Sutton 2019). Southeast applies basic rates estimated in these studies while Southcentral and Kodiak rates were derived by using historical depth-of-release data to adjust the rates based on area and user group.</w:t>
       </w:r>
     </w:p>
     <w:p>
@@ -16749,15 +16980,31 @@
         </m:sSub>
       </m:oMath>
       <w:r>
-        <w:t xml:space="preserve"> is the release mortality rate by year, area, user and species (Figure 8 REL_MORT).</w:t>
+        <w:t xml:space="preserve"> is the release mortality rate by year, area, user and species (Figure </w:t>
+      </w:r>
+      <w:del w:id="67" w:author="Joy, Philip J (DFG)" w:date="2026-10-12T10:03:00Z" w16du:dateUtc="2026-10-12T18:03:00Z">
+        <w:r>
+          <w:delText xml:space="preserve">8 </w:delText>
+        </w:r>
+      </w:del>
+      <w:ins w:id="68" w:author="Joy, Philip J (DFG)" w:date="2026-10-12T10:03:00Z" w16du:dateUtc="2026-10-12T18:03:00Z">
+        <w:r>
+          <w:t>7</w:t>
+        </w:r>
+        <w:r>
+          <w:t xml:space="preserve"> </w:t>
+        </w:r>
+      </w:ins>
+      <w:r>
+        <w:t>REL_MORT).</w:t>
       </w:r>
     </w:p>
     <w:p>
       <w:pPr>
         <w:pStyle w:val="Heading3"/>
       </w:pPr>
-      <w:bookmarkStart w:id="28" w:name="biomass-conversions"/>
-      <w:bookmarkEnd w:id="27"/>
+      <w:bookmarkStart w:id="69" w:name="biomass-conversions"/>
+      <w:bookmarkEnd w:id="64"/>
       <w:r>
         <w:t>Biomass conversions</w:t>
       </w:r>
@@ -17018,20 +17265,21 @@
       <w:pPr>
         <w:pStyle w:val="Heading2"/>
       </w:pPr>
-      <w:bookmarkStart w:id="29" w:name="_Toc242361792"/>
-      <w:bookmarkStart w:id="30" w:name="observation-equations"/>
-      <w:bookmarkEnd w:id="20"/>
-      <w:bookmarkEnd w:id="28"/>
-      <w:r>
+      <w:bookmarkStart w:id="70" w:name="_Toc242361792"/>
+      <w:bookmarkStart w:id="71" w:name="observation-equations"/>
+      <w:bookmarkEnd w:id="29"/>
+      <w:bookmarkEnd w:id="69"/>
+      <w:r>
+        <w:lastRenderedPageBreak/>
         <w:t>Observation equations</w:t>
       </w:r>
-      <w:bookmarkEnd w:id="29"/>
+      <w:bookmarkEnd w:id="70"/>
     </w:p>
     <w:p>
       <w:pPr>
         <w:pStyle w:val="Heading3"/>
       </w:pPr>
-      <w:bookmarkStart w:id="31" w:name="harvests-1"/>
+      <w:bookmarkStart w:id="72" w:name="harvests-1"/>
       <w:r>
         <w:t>Harvests</w:t>
       </w:r>
@@ -18545,7 +18793,6 @@
         <w:pStyle w:val="BodyText"/>
       </w:pPr>
       <w:r>
-        <w:lastRenderedPageBreak/>
         <w:t xml:space="preserve">Note that for Southcentral and Kodiak areas </w:t>
       </w:r>
       <m:oMath>
@@ -18737,8 +18984,8 @@
       <w:pPr>
         <w:pStyle w:val="Heading3"/>
       </w:pPr>
-      <w:bookmarkStart w:id="32" w:name="species-compositions-port-sampling"/>
-      <w:bookmarkEnd w:id="31"/>
+      <w:bookmarkStart w:id="73" w:name="species-compositions-port-sampling"/>
+      <w:bookmarkEnd w:id="72"/>
       <w:r>
         <w:t>Species Compositions (Port Sampling)</w:t>
       </w:r>
@@ -19894,8 +20141,8 @@
       <w:pPr>
         <w:pStyle w:val="Heading3"/>
       </w:pPr>
-      <w:bookmarkStart w:id="33" w:name="releases-1"/>
-      <w:bookmarkEnd w:id="32"/>
+      <w:bookmarkStart w:id="74" w:name="releases-1"/>
+      <w:bookmarkEnd w:id="73"/>
       <w:r>
         <w:t>Releases</w:t>
       </w:r>
@@ -21708,7 +21955,11 @@
         <w:pStyle w:val="BodyText"/>
       </w:pPr>
       <w:r>
-        <w:t xml:space="preserve">Angler interview data in Southeast showed discrepancies in the number of “other” rockfish released relative to the numbers reported in charter logbooks. Southeast “other” rockfish are comprised of slope and DSR assemblages, both of which may contribute to these discrepancies.  To accommodate apparent overdispersion in the angler interview data for the slope and DSR assemblages a logistic-normal random effect was used to inflate the variance (Molenberghs et al. 2010; Kassahun et al. 2012) such that the observed probability of being harvested in the interview data, </w:t>
+        <w:t xml:space="preserve">Angler interview data in Southeast showed discrepancies in the number of “other” rockfish released relative to the numbers reported in charter logbooks. Southeast “other” rockfish are comprised of slope and DSR assemblages, both of which may contribute to these discrepancies.  To accommodate apparent overdispersion in the angler interview data for the slope and DSR </w:t>
+      </w:r>
+      <w:r>
+        <w:lastRenderedPageBreak/>
+        <w:t xml:space="preserve">assemblages a logistic-normal random effect was used to inflate the variance (Molenberghs et al. 2010; Kassahun et al. 2012) such that the observed probability of being harvested in the interview data, </w:t>
       </w:r>
       <m:oMath>
         <m:r>
@@ -23466,19 +23717,15 @@
         </m:sSubSup>
       </m:oMath>
       <w:r>
-        <w:t xml:space="preserve"> ratios from the SWHS indicating unguided </w:t>
-      </w:r>
-      <w:r>
-        <w:lastRenderedPageBreak/>
-        <w:t>angler predilection for releasing fish relative to guided anglers. The portside interview data is the primary driver of unguided release estimates, but the other data sources and modelled interactions provide further information where interview data is limited or absent.</w:t>
+        <w:t xml:space="preserve"> ratios from the SWHS indicating unguided angler predilection for releasing fish relative to guided anglers. The portside interview data is the primary driver of unguided release estimates, but the other data sources and modelled interactions provide further information where interview data is limited or absent.</w:t>
       </w:r>
     </w:p>
     <w:p>
       <w:pPr>
         <w:pStyle w:val="Heading3"/>
       </w:pPr>
-      <w:bookmarkStart w:id="34" w:name="weights"/>
-      <w:bookmarkEnd w:id="33"/>
+      <w:bookmarkStart w:id="75" w:name="weights"/>
+      <w:bookmarkEnd w:id="74"/>
       <w:r>
         <w:t>Weights</w:t>
       </w:r>
@@ -24428,6 +24675,7 @@
         <w:pStyle w:val="BodyText"/>
       </w:pPr>
       <w:r>
+        <w:lastRenderedPageBreak/>
         <w:t xml:space="preserve">The </w:t>
       </w:r>
       <m:oMath>
@@ -25223,8 +25471,8 @@
       <w:pPr>
         <w:pStyle w:val="Heading3"/>
       </w:pPr>
-      <w:bookmarkStart w:id="35" w:name="X80429dd3efbff01d1a40e42b33042e32d99ec3c"/>
-      <w:bookmarkEnd w:id="34"/>
+      <w:bookmarkStart w:id="76" w:name="X80429dd3efbff01d1a40e42b33042e32d99ec3c"/>
+      <w:bookmarkEnd w:id="75"/>
       <w:r>
         <w:t>Kodiak Stereoscopic Species Apportionment</w:t>
       </w:r>
@@ -25439,7 +25687,6 @@
         <w:pStyle w:val="BodyText"/>
       </w:pPr>
       <w:r>
-        <w:lastRenderedPageBreak/>
         <w:t xml:space="preserve">where </w:t>
       </w:r>
       <m:oMath>
@@ -27067,6 +27314,7 @@
         <w:pStyle w:val="BodyText"/>
       </w:pPr>
       <w:r>
+        <w:lastRenderedPageBreak/>
         <w:t>and the variance is approximated using the delta method (Casella and Berger 2002) as</w:t>
       </w:r>
     </w:p>
@@ -27562,14 +27810,14 @@
       <w:pPr>
         <w:pStyle w:val="Heading2"/>
       </w:pPr>
-      <w:bookmarkStart w:id="36" w:name="_Toc242361793"/>
-      <w:bookmarkStart w:id="37" w:name="model-platform-and-diagnostics"/>
-      <w:bookmarkEnd w:id="30"/>
-      <w:bookmarkEnd w:id="35"/>
+      <w:bookmarkStart w:id="77" w:name="_Toc242361793"/>
+      <w:bookmarkStart w:id="78" w:name="model-platform-and-diagnostics"/>
+      <w:bookmarkEnd w:id="71"/>
+      <w:bookmarkEnd w:id="76"/>
       <w:r>
         <w:t>Model platform and diagnostics</w:t>
       </w:r>
-      <w:bookmarkEnd w:id="36"/>
+      <w:bookmarkEnd w:id="77"/>
     </w:p>
     <w:p>
       <w:pPr>
@@ -27698,25 +27946,21 @@
       <w:pPr>
         <w:pStyle w:val="Heading1"/>
       </w:pPr>
-      <w:bookmarkStart w:id="38" w:name="_Toc242361794"/>
-      <w:bookmarkStart w:id="39" w:name="results"/>
+      <w:bookmarkStart w:id="79" w:name="_Toc242361794"/>
+      <w:bookmarkStart w:id="80" w:name="results"/>
       <w:bookmarkEnd w:id="9"/>
-      <w:bookmarkEnd w:id="37"/>
+      <w:bookmarkEnd w:id="78"/>
       <w:r>
         <w:t>Results</w:t>
       </w:r>
-      <w:bookmarkEnd w:id="38"/>
+      <w:bookmarkEnd w:id="79"/>
     </w:p>
     <w:p>
       <w:pPr>
         <w:pStyle w:val="FirstParagraph"/>
       </w:pPr>
       <w:r>
-        <w:t xml:space="preserve">The estimation model was able to estimate harvests, releases and total removals (harvests plus release mortalities) with near complete convergence of model parameters. Harvest estimates were </w:t>
-      </w:r>
-      <w:r>
-        <w:lastRenderedPageBreak/>
-        <w:t>very similar to Howard et al. (2020) estimates but differed more in areas where private anglers were the dominant user group. Release estimates were also very similar to guided estimates from the Howard estimates as expected given that both methods rely on the census derived from the logbook program. However, estimates of unguided releases differed substantially from the Howard estimates, particularly in recent years that include portside interview data on release and retention behavior. The large difference is unsurprising given the bias correction undertaken in the Bayesian model, the use of the proportion harvested data from the logbook program, and the integration of the portside interview data.</w:t>
+        <w:t>The estimation model was able to estimate harvests, releases and total removals (harvests plus release mortalities) with near complete convergence of model parameters. Harvest estimates were very similar to Howard et al. (2020) estimates but differed more in areas where private anglers were the dominant user group. Release estimates were also very similar to guided estimates from the Howard estimates as expected given that both methods rely on the census derived from the logbook program. However, estimates of unguided releases differed substantially from the Howard estimates, particularly in recent years that include portside interview data on release and retention behavior. The large difference is unsurprising given the bias correction undertaken in the Bayesian model, the use of the proportion harvested data from the logbook program, and the integration of the portside interview data.</w:t>
       </w:r>
     </w:p>
     <w:p>
@@ -27969,6 +28213,7 @@
               <w:rPr>
                 <w:color w:val="000000"/>
               </w:rPr>
+              <w:lastRenderedPageBreak/>
               <w:t>Area</w:t>
             </w:r>
           </w:p>
@@ -30537,19 +30782,36 @@
       <w:pPr>
         <w:pStyle w:val="Heading2"/>
       </w:pPr>
-      <w:bookmarkStart w:id="40" w:name="_Toc242361795"/>
-      <w:bookmarkStart w:id="41" w:name="residual-patterns"/>
-      <w:r>
+      <w:bookmarkStart w:id="81" w:name="_Toc242361795"/>
+      <w:bookmarkStart w:id="82" w:name="residual-patterns"/>
+      <w:r>
+        <w:lastRenderedPageBreak/>
         <w:t>Residual Patterns</w:t>
       </w:r>
-      <w:bookmarkEnd w:id="40"/>
+      <w:bookmarkEnd w:id="81"/>
     </w:p>
     <w:p>
       <w:pPr>
         <w:pStyle w:val="FirstParagraph"/>
       </w:pPr>
       <w:r>
-        <w:t>Residual patterns of the fit of the data to the SWHS data were generally satisfactory, with a few exceptions. Large harvest residuals (Figure 9 SWHS_H_RESIDS) were often associated with poor precision in the SWHS estimates in all regions. PWSO demonstrated odd residual patterns associated with large uncertainty prior to 2000 with the model predicting higher harvests than demonstrated in the SWHS. Kodiak areas demonstrated some strange residual patterns in the WKMA and eastside CFMU’s, but were generally associated with poor precision in the estimates. Southeast harvests showed generally satisfactory residual patterns, although SSEO model results were consistently higher than survey estimates prior to 1992.</w:t>
+        <w:t xml:space="preserve">Residual patterns of the fit of the data to the SWHS data were generally satisfactory, with a few exceptions. Large harvest residuals (Figure </w:t>
+      </w:r>
+      <w:del w:id="83" w:author="Joy, Philip J (DFG)" w:date="2026-10-12T10:04:00Z" w16du:dateUtc="2026-10-12T18:04:00Z">
+        <w:r>
+          <w:delText xml:space="preserve">9 </w:delText>
+        </w:r>
+      </w:del>
+      <w:ins w:id="84" w:author="Joy, Philip J (DFG)" w:date="2026-10-12T10:04:00Z" w16du:dateUtc="2026-10-12T18:04:00Z">
+        <w:r>
+          <w:t>10</w:t>
+        </w:r>
+        <w:r>
+          <w:t xml:space="preserve"> </w:t>
+        </w:r>
+      </w:ins>
+      <w:r>
+        <w:t>SWHS_H_RESIDS) were often associated with poor precision in the SWHS estimates in all regions. PWSO demonstrated odd residual patterns associated with large uncertainty prior to 2000 with the model predicting higher harvests than demonstrated in the SWHS. Kodiak areas demonstrated some strange residual patterns in the WKMA and eastside CFMU’s, but were generally associated with poor precision in the estimates. Southeast harvests showed generally satisfactory residual patterns, although SSEO model results were consistently higher than survey estimates prior to 1992.</w:t>
       </w:r>
     </w:p>
     <w:p>
@@ -30557,7 +30819,26 @@
         <w:pStyle w:val="BodyText"/>
       </w:pPr>
       <w:r>
-        <w:t>Residual patterns for the SWHS release data showed much larger residuals as would be expected from the much less precise release estimates (Figure 10 SWHS_R_RESIDS). Overall, the release residuals tended to be more positive than negative. PWSO releases demonstrated the same pattern as that of the harvests.</w:t>
+        <w:t xml:space="preserve">Residual patterns for the SWHS release data showed much larger residuals as would be expected from the much less precise release estimates (Figure </w:t>
+      </w:r>
+      <w:del w:id="85" w:author="Joy, Philip J (DFG)" w:date="2026-10-12T10:04:00Z" w16du:dateUtc="2026-10-12T18:04:00Z">
+        <w:r>
+          <w:delText xml:space="preserve">10 </w:delText>
+        </w:r>
+      </w:del>
+      <w:ins w:id="86" w:author="Joy, Philip J (DFG)" w:date="2026-10-12T10:04:00Z" w16du:dateUtc="2026-10-12T18:04:00Z">
+        <w:r>
+          <w:t>1</w:t>
+        </w:r>
+        <w:r>
+          <w:t>1</w:t>
+        </w:r>
+        <w:r>
+          <w:t xml:space="preserve"> </w:t>
+        </w:r>
+      </w:ins>
+      <w:r>
+        <w:t>SWHS_R_RESIDS). Overall, the release residuals tended to be more positive than negative. PWSO releases demonstrated the same pattern as that of the harvests.</w:t>
       </w:r>
     </w:p>
     <w:p>
@@ -30565,28 +30846,138 @@
         <w:pStyle w:val="BodyText"/>
       </w:pPr>
       <w:r>
-        <w:t>Residual patterns of the fit to the logbook data show some patterns but are minor with respect to the overall number of fish being estimated (Figure 11 LB_RESIDS). Logbook data is fit with a poisson distribution which assumes a very small error and thus the model estimates are usually within 1% of the logbook value for both harvests and releases. There were some odd patterns in the North Gulf and both Prince William Sound CFMUs where the model predicted less harvests than logbook entries in the early years of the program and across all of southcentral and Kodiak CFMU’s the residuals are larger during that time period. These instances mirror the residual patterns in the SWHS and are the result of the model balancing the disagreement between the two data sources.</w:t>
+        <w:t xml:space="preserve">Residual patterns of the fit to the logbook data show some patterns but are minor with respect to the overall number of fish being estimated (Figure </w:t>
+      </w:r>
+      <w:del w:id="87" w:author="Joy, Philip J (DFG)" w:date="2026-10-12T10:04:00Z" w16du:dateUtc="2026-10-12T18:04:00Z">
+        <w:r>
+          <w:delText xml:space="preserve">11 </w:delText>
+        </w:r>
+      </w:del>
+      <w:ins w:id="88" w:author="Joy, Philip J (DFG)" w:date="2026-10-12T10:04:00Z" w16du:dateUtc="2026-10-12T18:04:00Z">
+        <w:r>
+          <w:t>1</w:t>
+        </w:r>
+        <w:r>
+          <w:t>2</w:t>
+        </w:r>
+        <w:r>
+          <w:t xml:space="preserve"> </w:t>
+        </w:r>
+      </w:ins>
+      <w:r>
+        <w:t>LB_RESIDS). Logbook data is fit with a poisson distribution which assumes a very small error and thus the model estimates are usually within 1% of the logbook value for both harvests and releases. There were some odd patterns in the North Gulf and both Prince William Sound CFMUs where the model predicted less harvests than logbook entries in the early years of the program and across all of southcentral and Kodiak CFMU’s the residuals are larger during that time period. These instances mirror the residual patterns in the SWHS and are the result of the model balancing the disagreement between the two data sources.</w:t>
       </w:r>
     </w:p>
     <w:p>
       <w:pPr>
         <w:pStyle w:val="Heading2"/>
       </w:pPr>
-      <w:bookmarkStart w:id="42" w:name="_Toc242361796"/>
-      <w:bookmarkStart w:id="43" w:name="bias-estimation"/>
-      <w:bookmarkEnd w:id="41"/>
-      <w:r>
-        <w:lastRenderedPageBreak/>
+      <w:bookmarkStart w:id="89" w:name="_Toc242361796"/>
+      <w:bookmarkStart w:id="90" w:name="bias-estimation"/>
+      <w:bookmarkEnd w:id="82"/>
+      <w:r>
         <w:t>Bias Estimation</w:t>
       </w:r>
-      <w:bookmarkEnd w:id="42"/>
+      <w:bookmarkEnd w:id="89"/>
     </w:p>
     <w:p>
       <w:pPr>
         <w:pStyle w:val="FirstParagraph"/>
       </w:pPr>
       <w:r>
-        <w:t>Observed bias in the SWHS refers to the difference between SWHS guided harvest and release estimates and that reported in charter logbooks (Figure 6 BIAS). Model predicted bias in SWHS harvest data tracked the observed bias well across years and CFMUs (Figure 12 YEARAREA_BIAS) but there was more discrepancies in the release data (Figure 13 YEARAREA_BIAS). Results demonstrated that SWHS estimates were generally biased low while release estimates were biased high (Figure 14 MEAN_BIAS). Observed and estimated harvest bias were very consistent with the exception of the very data poor BSAI CFMU (Figure 12 YEARAREA_BIAS).</w:t>
+        <w:t xml:space="preserve">Observed bias in the SWHS refers to the difference between SWHS guided harvest and release estimates and that reported in charter logbooks (Figure 6 BIAS). Model predicted bias in SWHS harvest data tracked the observed bias well across years and CFMUs (Figure </w:t>
+      </w:r>
+      <w:del w:id="91" w:author="Joy, Philip J (DFG)" w:date="2026-10-12T10:05:00Z" w16du:dateUtc="2026-10-12T18:05:00Z">
+        <w:r>
+          <w:delText xml:space="preserve">12 </w:delText>
+        </w:r>
+      </w:del>
+      <w:ins w:id="92" w:author="Joy, Philip J (DFG)" w:date="2026-10-12T10:05:00Z" w16du:dateUtc="2026-10-12T18:05:00Z">
+        <w:r>
+          <w:t>1</w:t>
+        </w:r>
+        <w:r>
+          <w:t>3</w:t>
+        </w:r>
+        <w:r>
+          <w:t xml:space="preserve"> </w:t>
+        </w:r>
+      </w:ins>
+      <w:r>
+        <w:t xml:space="preserve">YEARAREA_BIAS) but there </w:t>
+      </w:r>
+      <w:del w:id="93" w:author="Joy, Philip J (DFG)" w:date="2026-10-12T10:05:00Z" w16du:dateUtc="2026-10-12T18:05:00Z">
+        <w:r>
+          <w:delText xml:space="preserve">was </w:delText>
+        </w:r>
+      </w:del>
+      <w:ins w:id="94" w:author="Joy, Philip J (DFG)" w:date="2026-10-12T10:05:00Z" w16du:dateUtc="2026-10-12T18:05:00Z">
+        <w:r>
+          <w:t>were</w:t>
+        </w:r>
+        <w:r>
+          <w:t xml:space="preserve"> </w:t>
+        </w:r>
+      </w:ins>
+      <w:r>
+        <w:t xml:space="preserve">more discrepancies in the release data (Figure </w:t>
+      </w:r>
+      <w:del w:id="95" w:author="Joy, Philip J (DFG)" w:date="2026-10-12T10:05:00Z" w16du:dateUtc="2026-10-12T18:05:00Z">
+        <w:r>
+          <w:delText xml:space="preserve">13 </w:delText>
+        </w:r>
+      </w:del>
+      <w:ins w:id="96" w:author="Joy, Philip J (DFG)" w:date="2026-10-12T10:05:00Z" w16du:dateUtc="2026-10-12T18:05:00Z">
+        <w:r>
+          <w:t>1</w:t>
+        </w:r>
+        <w:r>
+          <w:t>4</w:t>
+        </w:r>
+        <w:r>
+          <w:t xml:space="preserve"> </w:t>
+        </w:r>
+      </w:ins>
+      <w:r>
+        <w:t xml:space="preserve">YEARAREA_BIAS). Results demonstrated that SWHS estimates were generally biased low while release estimates were biased high (Figure </w:t>
+      </w:r>
+      <w:del w:id="97" w:author="Joy, Philip J (DFG)" w:date="2026-10-12T10:05:00Z" w16du:dateUtc="2026-10-12T18:05:00Z">
+        <w:r>
+          <w:delText xml:space="preserve">14 </w:delText>
+        </w:r>
+      </w:del>
+      <w:ins w:id="98" w:author="Joy, Philip J (DFG)" w:date="2026-10-12T10:05:00Z" w16du:dateUtc="2026-10-12T18:05:00Z">
+        <w:r>
+          <w:t>1</w:t>
+        </w:r>
+        <w:r>
+          <w:t>5</w:t>
+        </w:r>
+        <w:r>
+          <w:t xml:space="preserve"> </w:t>
+        </w:r>
+      </w:ins>
+      <w:r>
+        <w:t xml:space="preserve">MEAN_BIAS). Observed and estimated harvest bias were very consistent with the exception of the very data poor BSAI CFMU (Figure </w:t>
+      </w:r>
+      <w:del w:id="99" w:author="Joy, Philip J (DFG)" w:date="2026-10-12T10:05:00Z" w16du:dateUtc="2026-10-12T18:05:00Z">
+        <w:r>
+          <w:delText xml:space="preserve">12 </w:delText>
+        </w:r>
+      </w:del>
+      <w:ins w:id="100" w:author="Joy, Philip J (DFG)" w:date="2026-10-12T10:05:00Z" w16du:dateUtc="2026-10-12T18:05:00Z">
+        <w:r>
+          <w:t>1</w:t>
+        </w:r>
+        <w:r>
+          <w:t>3</w:t>
+        </w:r>
+        <w:r>
+          <w:t xml:space="preserve"> </w:t>
+        </w:r>
+      </w:ins>
+      <w:r>
+        <w:t>YEARAREA_BIAS).</w:t>
       </w:r>
     </w:p>
     <w:p>
@@ -30594,7 +30985,45 @@
         <w:pStyle w:val="BodyText"/>
       </w:pPr>
       <w:r>
-        <w:t>Model estimated bias in SWHS release estimates differed more dramatically from the “observed” bias (Figure 13 YEARAREA_BIAS) and is the result of incorporating portside interview release data into the model. Release bias for the Southcentral areas and northeast Kodiak was much lower in the model relative to that observed when comparing logbook and SWHS data (Figure 13 YEARAREA_BIAS). When the portside interview data is omitted, the model estimated bias matches the observed similarly to that of the other regions. The reduced bias estimated with the inclusion of the interview data suggests that private anglers are providing less biased responses to the SWHS than guided anglers and/or logbook records of releases in this region are perhaps less accurate than would be assumed.</w:t>
+        <w:t xml:space="preserve">Model estimated bias in SWHS release estimates differed more dramatically from the “observed” bias (Figure </w:t>
+      </w:r>
+      <w:del w:id="101" w:author="Joy, Philip J (DFG)" w:date="2026-10-12T10:05:00Z" w16du:dateUtc="2026-10-12T18:05:00Z">
+        <w:r>
+          <w:delText xml:space="preserve">13 </w:delText>
+        </w:r>
+      </w:del>
+      <w:ins w:id="102" w:author="Joy, Philip J (DFG)" w:date="2026-10-12T10:05:00Z" w16du:dateUtc="2026-10-12T18:05:00Z">
+        <w:r>
+          <w:t>1</w:t>
+        </w:r>
+        <w:r>
+          <w:t>4</w:t>
+        </w:r>
+        <w:r>
+          <w:t xml:space="preserve"> </w:t>
+        </w:r>
+      </w:ins>
+      <w:r>
+        <w:t xml:space="preserve">YEARAREA_BIAS) and is the result of incorporating portside interview release data into the model. Release bias for the Southcentral areas and northeast Kodiak was much lower in the model relative to that observed when comparing logbook and SWHS data (Figure </w:t>
+      </w:r>
+      <w:del w:id="103" w:author="Joy, Philip J (DFG)" w:date="2026-10-12T10:06:00Z" w16du:dateUtc="2026-10-12T18:06:00Z">
+        <w:r>
+          <w:delText xml:space="preserve">13 </w:delText>
+        </w:r>
+      </w:del>
+      <w:ins w:id="104" w:author="Joy, Philip J (DFG)" w:date="2026-10-12T10:06:00Z" w16du:dateUtc="2026-10-12T18:06:00Z">
+        <w:r>
+          <w:t>1</w:t>
+        </w:r>
+        <w:r>
+          <w:t>4</w:t>
+        </w:r>
+        <w:r>
+          <w:t xml:space="preserve"> </w:t>
+        </w:r>
+      </w:ins>
+      <w:r>
+        <w:t>YEARAREA_BIAS). When the portside interview data is omitted, the model estimated bias matches the observed similarly to that of the other regions. The reduced bias estimated with the inclusion of the interview data suggests that private anglers are providing less biased responses to the SWHS than guided anglers and/or logbook records of releases in this region are perhaps less accurate than would be assumed.</w:t>
       </w:r>
     </w:p>
     <w:p>
@@ -30602,6 +31031,7 @@
         <w:pStyle w:val="BodyText"/>
       </w:pPr>
       <w:r>
+        <w:lastRenderedPageBreak/>
         <w:t>In contrast, the CSEO in southeast demonstrates much higher bias in the SWHS relative to the logbook data since 2019. This implies that the portside interview data is providing more biased estimates than would be inferred by the guided SWHS and logbook data alone.</w:t>
       </w:r>
     </w:p>
@@ -30609,20 +31039,17 @@
       <w:pPr>
         <w:pStyle w:val="Heading2"/>
       </w:pPr>
-      <w:bookmarkStart w:id="44" w:name="_Toc242361797"/>
-      <w:bookmarkStart w:id="45" w:name="proportion-harvested"/>
-      <w:bookmarkEnd w:id="43"/>
+      <w:bookmarkStart w:id="105" w:name="_Toc242361797"/>
+      <w:bookmarkStart w:id="106" w:name="proportion-harvested"/>
+      <w:bookmarkEnd w:id="90"/>
       <w:r>
         <w:t>Proportion Harvested</w:t>
       </w:r>
-      <w:bookmarkEnd w:id="44"/>
+      <w:bookmarkEnd w:id="105"/>
     </w:p>
     <w:p>
       <w:pPr>
         <w:pStyle w:val="FirstParagraph"/>
-        <w:rPr>
-          <w:ins w:id="46" w:author="Joy, Philip J (DFG)" w:date="2026-10-08T14:26:00Z" w16du:dateUtc="2026-10-08T22:26:00Z"/>
-        </w:rPr>
       </w:pPr>
       <w:r>
         <w:t>Estimates of the proportion harvested (</w:t>
@@ -30635,7 +31062,26 @@
         <w:t>pH</w:t>
       </w:r>
       <w:r>
-        <w:t xml:space="preserve">) for guided pelagic rockfish accurately tracked the logbook and portside interview data and the logistic curve fit to that data demonstrated reasonable patterns and uncertainty for hindcasting (Figure 15 pH_PEL). Logbook data and portside interviews of guided anglers provided similar estimates and demonstrated similar trends in </w:t>
+        <w:t xml:space="preserve">) for guided pelagic rockfish accurately tracked the logbook and portside interview data and the logistic curve fit to that data demonstrated reasonable patterns and uncertainty for hindcasting (Figure </w:t>
+      </w:r>
+      <w:del w:id="107" w:author="Joy, Philip J (DFG)" w:date="2026-10-12T10:06:00Z" w16du:dateUtc="2026-10-12T18:06:00Z">
+        <w:r>
+          <w:delText xml:space="preserve">15 </w:delText>
+        </w:r>
+      </w:del>
+      <w:ins w:id="108" w:author="Joy, Philip J (DFG)" w:date="2026-10-12T10:06:00Z" w16du:dateUtc="2026-10-12T18:06:00Z">
+        <w:r>
+          <w:t>1</w:t>
+        </w:r>
+        <w:r>
+          <w:t>6</w:t>
+        </w:r>
+        <w:r>
+          <w:t xml:space="preserve"> </w:t>
+        </w:r>
+      </w:ins>
+      <w:r>
+        <w:t xml:space="preserve">pH_PEL). Logbook data and portside interviews of guided anglers provided similar estimates and demonstrated similar trends in </w:t>
       </w:r>
       <w:r>
         <w:rPr>
@@ -30706,19 +31152,109 @@
       <w:r>
         <w:t xml:space="preserve"> prior on angler effects.</w:t>
       </w:r>
-    </w:p>
-    <w:p>
-      <w:pPr>
-        <w:pStyle w:val="BodyText"/>
-        <w:pPrChange w:id="47" w:author="Joy, Philip J (DFG)" w:date="2026-10-08T14:26:00Z" w16du:dateUtc="2026-10-08T22:26:00Z">
-          <w:pPr>
-            <w:pStyle w:val="FirstParagraph"/>
-          </w:pPr>
-        </w:pPrChange>
-      </w:pPr>
-      <w:ins w:id="48" w:author="Joy, Philip J (DFG)" w:date="2026-10-08T14:26:00Z" w16du:dateUtc="2026-10-08T22:26:00Z">
+      <w:ins w:id="109" w:author="Joy, Philip J (DFG)" w:date="2026-10-12T08:41:00Z" w16du:dateUtc="2026-10-12T16:41:00Z">
         <w:r>
-          <w:t>Insert something about prior.</w:t>
+          <w:t xml:space="preserve"> The </w:t>
+        </w:r>
+      </w:ins>
+      <m:oMath>
+        <m:r>
+          <w:ins w:id="110" w:author="Joy, Philip J (DFG)" w:date="2026-10-12T08:41:00Z" w16du:dateUtc="2026-10-12T16:41:00Z">
+            <w:rPr>
+              <w:rFonts w:ascii="Cambria Math" w:hAnsi="Cambria Math"/>
+            </w:rPr>
+            <m:t>p</m:t>
+          </w:ins>
+        </m:r>
+        <m:sSubSup>
+          <m:sSubSupPr>
+            <m:ctrlPr>
+              <w:ins w:id="111" w:author="Joy, Philip J (DFG)" w:date="2026-10-12T08:41:00Z" w16du:dateUtc="2026-10-12T16:41:00Z">
+                <w:rPr>
+                  <w:rFonts w:ascii="Cambria Math" w:hAnsi="Cambria Math"/>
+                </w:rPr>
+              </w:ins>
+            </m:ctrlPr>
+          </m:sSubSupPr>
+          <m:e>
+            <m:r>
+              <w:ins w:id="112" w:author="Joy, Philip J (DFG)" w:date="2026-10-12T08:41:00Z" w16du:dateUtc="2026-10-12T16:41:00Z">
+                <w:rPr>
+                  <w:rFonts w:ascii="Cambria Math" w:hAnsi="Cambria Math"/>
+                </w:rPr>
+                <m:t>H</m:t>
+              </w:ins>
+            </m:r>
+          </m:e>
+          <m:sub>
+            <m:r>
+              <w:ins w:id="113" w:author="Joy, Philip J (DFG)" w:date="2026-10-12T08:41:00Z" w16du:dateUtc="2026-10-12T16:41:00Z">
+                <w:rPr>
+                  <w:rFonts w:ascii="Cambria Math" w:hAnsi="Cambria Math"/>
+                </w:rPr>
+                <m:t>ay</m:t>
+              </w:ins>
+            </m:r>
+          </m:sub>
+          <m:sup>
+            <m:r>
+              <w:ins w:id="114" w:author="Joy, Philip J (DFG)" w:date="2026-10-12T08:41:00Z" w16du:dateUtc="2026-10-12T16:41:00Z">
+                <w:rPr>
+                  <w:rFonts w:ascii="Cambria Math" w:hAnsi="Cambria Math"/>
+                </w:rPr>
+                <m:t>ung</m:t>
+              </w:ins>
+            </m:r>
+            <m:r>
+              <w:ins w:id="115" w:author="Joy, Philip J (DFG)" w:date="2026-10-12T08:41:00Z" w16du:dateUtc="2026-10-12T16:41:00Z">
+                <m:rPr>
+                  <m:sty m:val="p"/>
+                </m:rPr>
+                <w:rPr>
+                  <w:rFonts w:ascii="Cambria Math" w:hAnsi="Cambria Math"/>
+                </w:rPr>
+                <m:t>:</m:t>
+              </w:ins>
+            </m:r>
+            <m:r>
+              <w:ins w:id="116" w:author="Joy, Philip J (DFG)" w:date="2026-10-12T08:41:00Z" w16du:dateUtc="2026-10-12T16:41:00Z">
+                <w:rPr>
+                  <w:rFonts w:ascii="Cambria Math" w:hAnsi="Cambria Math"/>
+                </w:rPr>
+                <m:t>gui</m:t>
+              </w:ins>
+            </m:r>
+          </m:sup>
+        </m:sSubSup>
+      </m:oMath>
+      <w:ins w:id="117" w:author="Joy, Philip J (DFG)" w:date="2026-10-12T08:42:00Z" w16du:dateUtc="2026-10-12T16:42:00Z">
+        <w:r>
+          <w:t xml:space="preserve">priors suggested that unguided anglers were more likely to release rockfish in most areas and time </w:t>
+        </w:r>
+      </w:ins>
+      <w:ins w:id="118" w:author="Joy, Philip J (DFG)" w:date="2026-10-12T08:43:00Z" w16du:dateUtc="2026-10-12T16:43:00Z">
+        <w:r>
+          <w:t xml:space="preserve">periods although </w:t>
+        </w:r>
+      </w:ins>
+      <w:ins w:id="119" w:author="Joy, Philip J (DFG)" w:date="2026-10-12T08:45:00Z" w16du:dateUtc="2026-10-12T16:45:00Z">
+        <w:r>
+          <w:t xml:space="preserve">confidence intervals around those values often included values above 1 where </w:t>
+        </w:r>
+      </w:ins>
+      <w:ins w:id="120" w:author="Joy, Philip J (DFG)" w:date="2026-10-12T08:46:00Z" w16du:dateUtc="2026-10-12T16:46:00Z">
+        <w:r>
+          <w:t xml:space="preserve">unguided anglers would be more likely to release a generic rockfish (Figure </w:t>
+        </w:r>
+      </w:ins>
+      <w:ins w:id="121" w:author="Joy, Philip J (DFG)" w:date="2026-10-12T10:06:00Z" w16du:dateUtc="2026-10-12T18:06:00Z">
+        <w:r>
+          <w:t>9</w:t>
+        </w:r>
+      </w:ins>
+      <w:ins w:id="122" w:author="Joy, Philip J (DFG)" w:date="2026-10-12T08:46:00Z" w16du:dateUtc="2026-10-12T16:46:00Z">
+        <w:r>
+          <w:t>).</w:t>
         </w:r>
       </w:ins>
     </w:p>
@@ -30735,11 +31271,26 @@
         <w:pStyle w:val="BodyText"/>
       </w:pPr>
       <w:r>
-        <w:t xml:space="preserve">The proportion harvested of yelloweye rockfish demonstrated a very different pattern from pelagic rockfish whereby anglers have retained almost all landed fish until recent years when management restrictions came into effect (Figure 16 pH_YE). This is most obvious in the Southeast CFMU’s where yelloweye retention was prohibited beginning in 2020 and to a lesser degree in Prince </w:t>
-      </w:r>
-      <w:r>
-        <w:lastRenderedPageBreak/>
-        <w:t>William Sound (CFMU PWSI and PWSO) where milder restrictions were enacted. Logbook and portside interviews data were mostly in agreement with regard to yelloweye retention. The model tracked the data well and the hindcasting applied a long term mean because the lack of appreciable change in the data since 2006.</w:t>
+        <w:t xml:space="preserve">The proportion harvested of yelloweye rockfish demonstrated a very different pattern from pelagic rockfish whereby anglers have retained almost all landed fish until recent years when management restrictions came into effect (Figure </w:t>
+      </w:r>
+      <w:del w:id="123" w:author="Joy, Philip J (DFG)" w:date="2026-10-12T10:06:00Z" w16du:dateUtc="2026-10-12T18:06:00Z">
+        <w:r>
+          <w:delText xml:space="preserve">16 </w:delText>
+        </w:r>
+      </w:del>
+      <w:ins w:id="124" w:author="Joy, Philip J (DFG)" w:date="2026-10-12T10:06:00Z" w16du:dateUtc="2026-10-12T18:06:00Z">
+        <w:r>
+          <w:t>1</w:t>
+        </w:r>
+        <w:r>
+          <w:t>7</w:t>
+        </w:r>
+        <w:r>
+          <w:t xml:space="preserve"> </w:t>
+        </w:r>
+      </w:ins>
+      <w:r>
+        <w:t>pH_YE). This is most obvious in the Southeast CFMU’s where yelloweye retention was prohibited beginning in 2020 and to a lesser degree in Prince William Sound (CFMU PWSI and PWSO) where milder restrictions were enacted. Logbook and portside interviews data were mostly in agreement with regard to yelloweye retention. The model tracked the data well and the hindcasting applied a long term mean because the lack of appreciable change in the data since 2006.</w:t>
       </w:r>
     </w:p>
     <w:p>
@@ -30783,7 +31334,26 @@
         </m:sSub>
       </m:oMath>
       <w:r>
-        <w:t>) the proportion harvested demonstrated variable patterns across regions (Figure 17 pH_OTHER). Central regions demonstrated a static pattern with the exception of Cook Inlet where retention probabilities increased over the observed time period. Kodiak demonstrated increasing retention probabilities with the exception of the WKMA CFMUs which were static. For these two regions, the portside interview data tracked logbook records to various degrees but demonstrated greater differences relative to the other species assemblages.</w:t>
+        <w:t xml:space="preserve">) the proportion harvested demonstrated variable patterns across regions (Figure </w:t>
+      </w:r>
+      <w:del w:id="125" w:author="Joy, Philip J (DFG)" w:date="2026-10-12T10:07:00Z" w16du:dateUtc="2026-10-12T18:07:00Z">
+        <w:r>
+          <w:delText xml:space="preserve">17 </w:delText>
+        </w:r>
+      </w:del>
+      <w:ins w:id="126" w:author="Joy, Philip J (DFG)" w:date="2026-10-12T10:07:00Z" w16du:dateUtc="2026-10-12T18:07:00Z">
+        <w:r>
+          <w:t>1</w:t>
+        </w:r>
+        <w:r>
+          <w:t>8</w:t>
+        </w:r>
+        <w:r>
+          <w:t xml:space="preserve"> </w:t>
+        </w:r>
+      </w:ins>
+      <w:r>
+        <w:t>pH_OTHER). Central regions demonstrated a static pattern with the exception of Cook Inlet where retention probabilities increased over the observed time period. Kodiak demonstrated increasing retention probabilities with the exception of the WKMA CFMUs which were static. For these two regions, the portside interview data tracked logbook records to various degrees but demonstrated greater differences relative to the other species assemblages.</w:t>
       </w:r>
     </w:p>
     <w:p>
@@ -30791,7 +31361,62 @@
         <w:pStyle w:val="BodyText"/>
       </w:pPr>
       <w:r>
-        <w:t xml:space="preserve">Southeast CFMU’s show a pattern similar to that of yelloweye rockfish with high retention prior to management restrictions enacted in recent years, but with greater discrepancies between the logbook and portside interview data. The model tracked the logbook data for guided anglers and estimates of unguided releases showed considerable uncertainty even in recent years as a result of high overdispersion in the interview data that is evident from the disparity between logbook and interview data (Figure 17 pH_OTHER). The “other” rockfish in Southeast Alaska are comprised of slope rockfish and non-yelloweye DSR rockfish, which further informs the model but introduces more tension as the likelihoods compete over the contradictory data. The retention probability of non-yelloweye DSR (Figure XX pH_DSR) and slope rockfish (Figure XX pH_SLOPE) are fit using the portside interview data while the sum of those releases must be equal to the release of the “other” rockfish that are fit to the portside and logbook data. The resolution of these sometimes contradictory signals results in </w:t>
+        <w:t xml:space="preserve">Southeast CFMU’s show a pattern similar to that of yelloweye rockfish with high retention prior to management restrictions enacted in recent years, but with greater discrepancies between the logbook and portside interview data. The model tracked the logbook data for guided anglers and estimates of unguided releases showed considerable uncertainty even in recent years as a result of high overdispersion in the interview data that is evident from the disparity between logbook and interview data (Figure </w:t>
+      </w:r>
+      <w:del w:id="127" w:author="Joy, Philip J (DFG)" w:date="2026-10-12T10:07:00Z" w16du:dateUtc="2026-10-12T18:07:00Z">
+        <w:r>
+          <w:delText xml:space="preserve">17 </w:delText>
+        </w:r>
+      </w:del>
+      <w:ins w:id="128" w:author="Joy, Philip J (DFG)" w:date="2026-10-12T10:07:00Z" w16du:dateUtc="2026-10-12T18:07:00Z">
+        <w:r>
+          <w:t>1</w:t>
+        </w:r>
+        <w:r>
+          <w:t>8</w:t>
+        </w:r>
+        <w:r>
+          <w:t xml:space="preserve"> </w:t>
+        </w:r>
+      </w:ins>
+      <w:r>
+        <w:t xml:space="preserve">pH_OTHER). The “other” rockfish in Southeast Alaska are comprised of slope rockfish and non-yelloweye DSR rockfish, which further informs the model </w:t>
+      </w:r>
+      <w:r>
+        <w:lastRenderedPageBreak/>
+        <w:t xml:space="preserve">but introduces more tension as the likelihoods compete over the contradictory data. The retention probability of non-yelloweye DSR (Figure </w:t>
+      </w:r>
+      <w:del w:id="129" w:author="Joy, Philip J (DFG)" w:date="2026-10-12T10:07:00Z" w16du:dateUtc="2026-10-12T18:07:00Z">
+        <w:r>
+          <w:delText xml:space="preserve">XX </w:delText>
+        </w:r>
+      </w:del>
+      <w:ins w:id="130" w:author="Joy, Philip J (DFG)" w:date="2026-10-12T10:07:00Z" w16du:dateUtc="2026-10-12T18:07:00Z">
+        <w:r>
+          <w:t>19</w:t>
+        </w:r>
+        <w:r>
+          <w:t xml:space="preserve"> </w:t>
+        </w:r>
+      </w:ins>
+      <w:r>
+        <w:t xml:space="preserve">pH_DSR) and slope rockfish (Figure </w:t>
+      </w:r>
+      <w:del w:id="131" w:author="Joy, Philip J (DFG)" w:date="2026-10-12T10:07:00Z" w16du:dateUtc="2026-10-12T18:07:00Z">
+        <w:r>
+          <w:delText xml:space="preserve">XX </w:delText>
+        </w:r>
+      </w:del>
+      <w:ins w:id="132" w:author="Joy, Philip J (DFG)" w:date="2026-10-12T10:07:00Z" w16du:dateUtc="2026-10-12T18:07:00Z">
+        <w:r>
+          <w:t>20</w:t>
+        </w:r>
+        <w:r>
+          <w:t xml:space="preserve"> </w:t>
+        </w:r>
+      </w:ins>
+      <w:r>
+        <w:t xml:space="preserve">pH_SLOPE) are fit using the portside interview data while the sum of those releases must be equal to the release of the “other” rockfish that are fit to the portside and logbook data. The resolution of these sometimes contradictory signals results in </w:t>
       </w:r>
       <w:r>
         <w:rPr>
@@ -30801,7 +31426,23 @@
         <w:t>pH</w:t>
       </w:r>
       <w:r>
-        <w:t xml:space="preserve"> estimates for DSR that follow the data (Figure XX pH_DSR), but </w:t>
+        <w:t xml:space="preserve"> estimates for DSR that follow the data (Figure </w:t>
+      </w:r>
+      <w:del w:id="133" w:author="Joy, Philip J (DFG)" w:date="2026-10-12T10:07:00Z" w16du:dateUtc="2026-10-12T18:07:00Z">
+        <w:r>
+          <w:delText xml:space="preserve">XX </w:delText>
+        </w:r>
+      </w:del>
+      <w:ins w:id="134" w:author="Joy, Philip J (DFG)" w:date="2026-10-12T10:07:00Z" w16du:dateUtc="2026-10-12T18:07:00Z">
+        <w:r>
+          <w:t>19</w:t>
+        </w:r>
+        <w:r>
+          <w:t xml:space="preserve"> </w:t>
+        </w:r>
+      </w:ins>
+      <w:r>
+        <w:t xml:space="preserve">pH_DSR), but </w:t>
       </w:r>
       <w:r>
         <w:rPr>
@@ -30811,27 +31452,59 @@
         <w:t>pH</w:t>
       </w:r>
       <w:r>
-        <w:t xml:space="preserve"> estimates for slope rockfish in the SSEO that are substantially less than that reported in portside interviews (Figure XX pH_SLOPE). Sample sizes for slope rockfish are generally smaller than for DSR, particularly in the SSEO and thus the model resolves the conflicting data signals in favor of the DSR data relative to the slope rockfish data.</w:t>
+        <w:t xml:space="preserve"> estimates for slope rockfish in the SSEO that are substantially less than that reported in portside interviews (Figure </w:t>
+      </w:r>
+      <w:del w:id="135" w:author="Joy, Philip J (DFG)" w:date="2026-10-12T10:07:00Z" w16du:dateUtc="2026-10-12T18:07:00Z">
+        <w:r>
+          <w:delText xml:space="preserve">XX </w:delText>
+        </w:r>
+      </w:del>
+      <w:ins w:id="136" w:author="Joy, Philip J (DFG)" w:date="2026-10-12T10:07:00Z" w16du:dateUtc="2026-10-12T18:07:00Z">
+        <w:r>
+          <w:t>20</w:t>
+        </w:r>
+        <w:r>
+          <w:t xml:space="preserve"> </w:t>
+        </w:r>
+      </w:ins>
+      <w:r>
+        <w:t>pH_SLOPE). Sample sizes for slope rockfish are generally smaller than for DSR, particularly in the SSEO and thus the model resolves the conflicting data signals in favor of the DSR data relative to the slope rockfish data.</w:t>
       </w:r>
     </w:p>
     <w:p>
       <w:pPr>
         <w:pStyle w:val="Heading2"/>
       </w:pPr>
-      <w:bookmarkStart w:id="49" w:name="_Toc242361798"/>
-      <w:bookmarkStart w:id="50" w:name="species-composition"/>
-      <w:bookmarkEnd w:id="45"/>
+      <w:bookmarkStart w:id="137" w:name="_Toc242361798"/>
+      <w:bookmarkStart w:id="138" w:name="species-composition"/>
+      <w:bookmarkEnd w:id="106"/>
       <w:r>
         <w:t>Species Composition</w:t>
       </w:r>
-      <w:bookmarkEnd w:id="49"/>
+      <w:bookmarkEnd w:id="137"/>
     </w:p>
     <w:p>
       <w:pPr>
         <w:pStyle w:val="FirstParagraph"/>
       </w:pPr>
       <w:r>
-        <w:t xml:space="preserve">The species composition of the harvests tracked the observed data well and produced reasonable logistic curves for hindcasting. The pelagic proportion demonstrated either an increasing trend in the harvests (Southeast and Prince William Sound) or a static trend (Kodiak, Cook Inlet and North Gulf) (Figure 18 P_PEL). Model estimates tracked the observed data well and fell towards the trend line when sample sizes were small or absent. The logistic hindcasting curve appeared to match the trends in the data and encompassed the uncertainty derived from the random effect estimates. The prior applied to the </w:t>
+        <w:t xml:space="preserve">The species composition of the harvests tracked the observed data well and produced reasonable logistic curves for hindcasting. The pelagic proportion demonstrated either an increasing trend in the harvests (Southeast and Prince William Sound) or a static trend (Kodiak, Cook Inlet and North Gulf) (Figure </w:t>
+      </w:r>
+      <w:del w:id="139" w:author="Joy, Philip J (DFG)" w:date="2026-10-12T10:08:00Z" w16du:dateUtc="2026-10-12T18:08:00Z">
+        <w:r>
+          <w:delText xml:space="preserve">18 </w:delText>
+        </w:r>
+      </w:del>
+      <w:ins w:id="140" w:author="Joy, Philip J (DFG)" w:date="2026-10-12T10:08:00Z" w16du:dateUtc="2026-10-12T18:08:00Z">
+        <w:r>
+          <w:t>21</w:t>
+        </w:r>
+        <w:r>
+          <w:t xml:space="preserve"> </w:t>
+        </w:r>
+      </w:ins>
+      <w:r>
+        <w:t xml:space="preserve">P_PEL). Model estimates tracked the observed data well and fell towards the trend line when sample sizes were small or absent. The logistic hindcasting curve appeared to match the trends in the data and encompassed the uncertainty derived from the random effect estimates. The prior applied to the </w:t>
       </w:r>
       <m:oMath>
         <m:r>
@@ -31005,11 +31678,36 @@
         </m:sSub>
       </m:oMath>
       <w:r>
-        <w:t xml:space="preserve"> were generally well converged with the exception of the Prince William Sound areas and the NSEI in Southeast, which were slow to converge. In these areas the port sampling data and the logbook data differ significantly and the model struggled to fit both of these data sources (Figure 18 P_PEL). Port sampling programs in this region are not proportional to the effort and thus the proportions are weighted to account for that issue (Howard et al. 2020). However, event the adjusted values do not align with the logbook data and thus </w:t>
-      </w:r>
-      <w:r>
-        <w:lastRenderedPageBreak/>
-        <w:t>remains an outstanding issue. As it stands, the model favors the logbook data over the port sampling data due to the nature of the relative likelihoods (Figure 18 P_Pel).</w:t>
+        <w:t xml:space="preserve"> were generally well converged with the exception of the Prince William Sound areas and the NSEI in Southeast, which were slow to converge. In these areas the port sampling data and the logbook data differ significantly and the model struggled to fit both of these data sources (Figure </w:t>
+      </w:r>
+      <w:del w:id="141" w:author="Joy, Philip J (DFG)" w:date="2026-10-12T10:08:00Z" w16du:dateUtc="2026-10-12T18:08:00Z">
+        <w:r>
+          <w:delText xml:space="preserve">18 </w:delText>
+        </w:r>
+      </w:del>
+      <w:ins w:id="142" w:author="Joy, Philip J (DFG)" w:date="2026-10-12T10:08:00Z" w16du:dateUtc="2026-10-12T18:08:00Z">
+        <w:r>
+          <w:t>21</w:t>
+        </w:r>
+        <w:r>
+          <w:t xml:space="preserve"> </w:t>
+        </w:r>
+      </w:ins>
+      <w:r>
+        <w:t xml:space="preserve">P_PEL). Port sampling programs in this region are not proportional to the effort and thus the proportions are weighted to account for that issue (Howard et al. 2020). However, event the adjusted values do not align with the logbook data and thus remains an outstanding issue. As it stands, the model favors the logbook data over the port sampling data due to the nature of the relative likelihoods (Figure </w:t>
+      </w:r>
+      <w:del w:id="143" w:author="Joy, Philip J (DFG)" w:date="2026-10-12T10:08:00Z" w16du:dateUtc="2026-10-12T18:08:00Z">
+        <w:r>
+          <w:delText xml:space="preserve">18 </w:delText>
+        </w:r>
+      </w:del>
+      <w:ins w:id="144" w:author="Joy, Philip J (DFG)" w:date="2026-10-12T10:08:00Z" w16du:dateUtc="2026-10-12T18:08:00Z">
+        <w:r>
+          <w:t xml:space="preserve">21 </w:t>
+        </w:r>
+      </w:ins>
+      <w:r>
+        <w:t>P_Pel).</w:t>
       </w:r>
     </w:p>
     <w:p>
@@ -31017,7 +31715,23 @@
         <w:pStyle w:val="BodyText"/>
       </w:pPr>
       <w:r>
-        <w:t xml:space="preserve">The proportion of pelagic rockfish that were black proved to be static, with the exception of Cook Inlet, which showed an increase, and NSEI, which showed a decrease (Figure 19 P_BLACK). The model tracked observed values well and applied the uncertainty derived from the random effects in the hindcast values. Applying the hydroacoustic survey data to Kodiak </w:t>
+        <w:t xml:space="preserve">The proportion of pelagic rockfish that were black proved to be static, with the exception of Cook Inlet, which showed an increase, and NSEI, which showed a decrease (Figure </w:t>
+      </w:r>
+      <w:del w:id="145" w:author="Joy, Philip J (DFG)" w:date="2026-10-12T10:08:00Z" w16du:dateUtc="2026-10-12T18:08:00Z">
+        <w:r>
+          <w:delText xml:space="preserve">19 </w:delText>
+        </w:r>
+      </w:del>
+      <w:ins w:id="146" w:author="Joy, Philip J (DFG)" w:date="2026-10-12T10:08:00Z" w16du:dateUtc="2026-10-12T18:08:00Z">
+        <w:r>
+          <w:t>22</w:t>
+        </w:r>
+        <w:r>
+          <w:t xml:space="preserve"> </w:t>
+        </w:r>
+      </w:ins>
+      <w:r>
+        <w:t xml:space="preserve">P_BLACK). The model tracked observed values well and applied the uncertainty derived from the random effects in the hindcast values. Applying the hydroacoustic survey data to Kodiak </w:t>
       </w:r>
       <m:oMath>
         <m:sSub>
@@ -31072,7 +31786,30 @@
         <w:pStyle w:val="BodyText"/>
       </w:pPr>
       <w:r>
-        <w:t>The yelloweye proportion demonstrated a static portion of the harvest in Kodiak, a subtle decline in Southcentral areas and a precipitous drop in Southeast where management restrictions were in place in recent years (Figure 20 P_YE). Southcentral data is noisy, but the fitted logistic curve appeared to capture the change in species composition during the observed time period and provided acceptable values for hindcasting with the appropriate level of uncertainty. Kodiak yelloweye trends were poorly informed due to a lack of data associated with consistently low harvests of yelloweye in this region. Southeast yelloweye proportions (relative to the DSR assemblage) were also somewhat noisy, but the trends in the data were adequately captured by the fitted logistic curve.</w:t>
+        <w:t xml:space="preserve">The yelloweye proportion demonstrated a static portion of the harvest in Kodiak, a subtle decline in Southcentral areas and a precipitous drop in Southeast where management restrictions were in place in recent years (Figure </w:t>
+      </w:r>
+      <w:del w:id="147" w:author="Joy, Philip J (DFG)" w:date="2026-10-12T10:08:00Z" w16du:dateUtc="2026-10-12T18:08:00Z">
+        <w:r>
+          <w:delText xml:space="preserve">20 </w:delText>
+        </w:r>
+      </w:del>
+      <w:ins w:id="148" w:author="Joy, Philip J (DFG)" w:date="2026-10-12T10:08:00Z" w16du:dateUtc="2026-10-12T18:08:00Z">
+        <w:r>
+          <w:t>2</w:t>
+        </w:r>
+        <w:r>
+          <w:t>3</w:t>
+        </w:r>
+        <w:r>
+          <w:t xml:space="preserve"> </w:t>
+        </w:r>
+      </w:ins>
+      <w:r>
+        <w:t xml:space="preserve">P_YE). Southcentral data is noisy, but the fitted logistic curve appeared to capture the change in species composition during the observed time period and provided acceptable values for hindcasting with the appropriate level of uncertainty. Kodiak yelloweye trends were poorly informed due to a lack of data associated with consistently low harvests of yelloweye in this region. Southeast yelloweye proportions (relative to the DSR </w:t>
+      </w:r>
+      <w:r>
+        <w:lastRenderedPageBreak/>
+        <w:t>assemblage) were also somewhat noisy, but the trends in the data were adequately captured by the fitted logistic curve.</w:t>
       </w:r>
     </w:p>
     <w:p>
@@ -31080,27 +31817,83 @@
         <w:pStyle w:val="BodyText"/>
       </w:pPr>
       <w:r>
-        <w:t>The proportion of the Southeast harvest that were DSR and slope rockfish also appeared to track the data well and provide reasonable predictions for hindcasting (Figure P_DSR 21, P_SLOPE 22, P_SLOPE_REL 23). The trends in these two assemblages indicate that prior to restrictions being placed on yelloweye and DSR, the vast bulk of the non-pelagic harvests in Southeast were DSR species with slope species comprising only a minor proportion. However, with the closure of yelloweye and restrictions on DSR the proportion of the harvest that were slope rose steeply in recent years.</w:t>
+        <w:t xml:space="preserve">The proportion of the Southeast harvest that were DSR and slope rockfish also appeared to track the data well and provide reasonable predictions for hindcasting (Figure P_DSR </w:t>
+      </w:r>
+      <w:del w:id="149" w:author="Joy, Philip J (DFG)" w:date="2026-10-12T10:08:00Z" w16du:dateUtc="2026-10-12T18:08:00Z">
+        <w:r>
+          <w:delText>21</w:delText>
+        </w:r>
+      </w:del>
+      <w:ins w:id="150" w:author="Joy, Philip J (DFG)" w:date="2026-10-12T10:08:00Z" w16du:dateUtc="2026-10-12T18:08:00Z">
+        <w:r>
+          <w:t>2</w:t>
+        </w:r>
+        <w:r>
+          <w:t>4</w:t>
+        </w:r>
+      </w:ins>
+      <w:r>
+        <w:t xml:space="preserve">, P_SLOPE </w:t>
+      </w:r>
+      <w:del w:id="151" w:author="Joy, Philip J (DFG)" w:date="2026-10-12T10:09:00Z" w16du:dateUtc="2026-10-12T18:09:00Z">
+        <w:r>
+          <w:delText>22</w:delText>
+        </w:r>
+      </w:del>
+      <w:ins w:id="152" w:author="Joy, Philip J (DFG)" w:date="2026-10-12T10:09:00Z" w16du:dateUtc="2026-10-12T18:09:00Z">
+        <w:r>
+          <w:t>2</w:t>
+        </w:r>
+        <w:r>
+          <w:t>5</w:t>
+        </w:r>
+      </w:ins>
+      <w:del w:id="153" w:author="Joy, Philip J (DFG)" w:date="2026-10-12T10:09:00Z" w16du:dateUtc="2026-10-12T18:09:00Z">
+        <w:r>
+          <w:delText>, P_SLOPE_REL 23</w:delText>
+        </w:r>
+      </w:del>
+      <w:r>
+        <w:t>). The trends in these two assemblages indicate that prior to restrictions being placed on yelloweye and DSR, the vast bulk of the non-pelagic harvests in Southeast were DSR species with slope species comprising only a minor proportion. However, with the closure of yelloweye and restrictions on DSR the proportion of the harvest that were slope rose steeply in recent years.</w:t>
       </w:r>
     </w:p>
     <w:p>
       <w:pPr>
         <w:pStyle w:val="Heading2"/>
       </w:pPr>
-      <w:bookmarkStart w:id="51" w:name="_Toc242361799"/>
-      <w:bookmarkStart w:id="52" w:name="proportion-guided"/>
-      <w:bookmarkEnd w:id="50"/>
+      <w:bookmarkStart w:id="154" w:name="_Toc242361799"/>
+      <w:bookmarkStart w:id="155" w:name="proportion-guided"/>
+      <w:bookmarkEnd w:id="138"/>
       <w:r>
         <w:t>Proportion Guided</w:t>
       </w:r>
-      <w:bookmarkEnd w:id="51"/>
+      <w:bookmarkEnd w:id="154"/>
     </w:p>
     <w:p>
       <w:pPr>
         <w:pStyle w:val="FirstParagraph"/>
       </w:pPr>
       <w:r>
-        <w:t xml:space="preserve">Data on the proportion of total rockfish catches that were guided is lacking and there was no trend estimated for hindcasting these parameters. The model captured the observed estimates within the credibility intervals but tended to smooth the observed estimates (Figure 24 pG). Difference btween the observed pG and that estimated by the model are the result of bias correction in SWHS estimates and more informed estimates of unguided angler harvests. Without a modeled trend, the model essentially uses a long-term average as described by the estimated beta distribution of the </w:t>
+        <w:t xml:space="preserve">Data on the proportion of total rockfish catches that were guided is lacking and there was no trend estimated for hindcasting these parameters. The model captured the observed estimates within the credibility intervals but tended to smooth the observed estimates (Figure </w:t>
+      </w:r>
+      <w:del w:id="156" w:author="Joy, Philip J (DFG)" w:date="2026-10-12T10:09:00Z" w16du:dateUtc="2026-10-12T18:09:00Z">
+        <w:r>
+          <w:delText xml:space="preserve">24 </w:delText>
+        </w:r>
+      </w:del>
+      <w:ins w:id="157" w:author="Joy, Philip J (DFG)" w:date="2026-10-12T10:09:00Z" w16du:dateUtc="2026-10-12T18:09:00Z">
+        <w:r>
+          <w:t>2</w:t>
+        </w:r>
+        <w:r>
+          <w:t>6</w:t>
+        </w:r>
+        <w:r>
+          <w:t xml:space="preserve"> </w:t>
+        </w:r>
+      </w:ins>
+      <w:r>
+        <w:t xml:space="preserve">pG). Difference btween the observed pG and that estimated by the model are the result of bias correction in SWHS estimates and more informed estimates of unguided angler harvests. Without a modeled trend, the model essentially uses a long-term average as described by the estimated beta distribution of the </w:t>
       </w:r>
       <m:oMath>
         <m:sSub>
@@ -31137,13 +31930,13 @@
       <w:pPr>
         <w:pStyle w:val="Heading2"/>
       </w:pPr>
-      <w:bookmarkStart w:id="53" w:name="_Toc242361800"/>
-      <w:bookmarkStart w:id="54" w:name="weight"/>
-      <w:bookmarkEnd w:id="52"/>
+      <w:bookmarkStart w:id="158" w:name="_Toc242361800"/>
+      <w:bookmarkStart w:id="159" w:name="weight"/>
+      <w:bookmarkEnd w:id="155"/>
       <w:r>
         <w:t>Weight</w:t>
       </w:r>
-      <w:bookmarkEnd w:id="53"/>
+      <w:bookmarkEnd w:id="158"/>
     </w:p>
     <w:p>
       <w:pPr>
@@ -31157,20 +31950,19 @@
       <w:pPr>
         <w:pStyle w:val="Heading2"/>
       </w:pPr>
-      <w:bookmarkStart w:id="55" w:name="_Toc242361801"/>
-      <w:bookmarkStart w:id="56" w:name="X9d99479f46dec730a7a401f5db2083d62218015"/>
-      <w:bookmarkEnd w:id="54"/>
-      <w:r>
-        <w:lastRenderedPageBreak/>
+      <w:bookmarkStart w:id="160" w:name="_Toc242361801"/>
+      <w:bookmarkStart w:id="161" w:name="X9d99479f46dec730a7a401f5db2083d62218015"/>
+      <w:bookmarkEnd w:id="159"/>
+      <w:r>
         <w:t>Harvest, Release and Total Removal Estimates</w:t>
       </w:r>
-      <w:bookmarkEnd w:id="55"/>
+      <w:bookmarkEnd w:id="160"/>
     </w:p>
     <w:p>
       <w:pPr>
         <w:pStyle w:val="Heading3"/>
       </w:pPr>
-      <w:bookmarkStart w:id="57" w:name="harvests-2"/>
+      <w:bookmarkStart w:id="162" w:name="harvests-2"/>
       <w:r>
         <w:t>Harvests</w:t>
       </w:r>
@@ -31180,7 +31972,26 @@
         <w:pStyle w:val="FirstParagraph"/>
       </w:pPr>
       <w:r>
-        <w:t>Total rockfish harvests demonstrate a generally increasing trend across the time series with some plateauing in recent years as a result of management restrictions (Figure 25 H_ALL; Appendix C1). Prior to 1998 when the logbook program went into effect, there is greater uncertainty in estimates and harvests were generally low. Some areas such as Cook Inlet (CI), North Gulf (NG), Northeast Kodiak and many of the Southeast CFMUs demonstrate consistent harvests during that time period. Harvest estimates from the Bayesian model are very consistent with Howard method estimates with some exceptions. There are some differences in the 1998-2001 period when the Howard methods made assumptions to deal with data limitations that were more appropriately handled with the hierarchical approach in the Bayesian model. There are also differences in some of the Kodiak areas where the Howard methods borrowed values from the most data rich Kodiak CFMUs whereas the Bayesian model applies a hierarchical approach to leverage all of the available data.</w:t>
+        <w:t xml:space="preserve">Total rockfish harvests demonstrate a generally increasing trend across the time series with some plateauing in recent years as a result of management restrictions (Figure </w:t>
+      </w:r>
+      <w:del w:id="163" w:author="Joy, Philip J (DFG)" w:date="2026-10-12T10:09:00Z" w16du:dateUtc="2026-10-12T18:09:00Z">
+        <w:r>
+          <w:delText xml:space="preserve">25 </w:delText>
+        </w:r>
+      </w:del>
+      <w:ins w:id="164" w:author="Joy, Philip J (DFG)" w:date="2026-10-12T10:09:00Z" w16du:dateUtc="2026-10-12T18:09:00Z">
+        <w:r>
+          <w:t>2</w:t>
+        </w:r>
+        <w:r>
+          <w:t>7</w:t>
+        </w:r>
+        <w:r>
+          <w:t xml:space="preserve"> </w:t>
+        </w:r>
+      </w:ins>
+      <w:r>
+        <w:t>H_ALL; Appendix C1). Prior to 1998 when the logbook program went into effect, there is greater uncertainty in estimates and harvests were generally low. Some areas such as Cook Inlet (CI), North Gulf (NG), Northeast Kodiak and many of the Southeast CFMUs demonstrate consistent harvests during that time period. Harvest estimates from the Bayesian model are very consistent with Howard method estimates with some exceptions. There are some differences in the 1998-2001 period when the Howard methods made assumptions to deal with data limitations that were more appropriately handled with the hierarchical approach in the Bayesian model. There are also differences in some of the Kodiak areas where the Howard methods borrowed values from the most data rich Kodiak CFMUs whereas the Bayesian model applies a hierarchical approach to leverage all of the available data.</w:t>
       </w:r>
     </w:p>
     <w:p>
@@ -31188,7 +31999,30 @@
         <w:pStyle w:val="BodyText"/>
       </w:pPr>
       <w:r>
-        <w:t>Black rockfish harvests demonstrate an increasing trend over the time series that is dominated by guided anglers with the exception of PWSI (Figure 26 H_BLACK, Appendix C2). Harvests prior to 1998 are generally low, but the North Gulf (NG), Northeast Kodiak, and the SSEI, NSEI and CSEO CFMU’s in Southeast had significant harvests during that time period. Guided estimates are very precise since the logbook program went into effect and port sampling programs provide robust samples for understanding the black rockfish proportion of the pelagic harvest. Unguided harvests are more uncertain as would be expected given their reliance on the SWHS estimates. Unguided estimates are similar to the Howard estimates and where they differ the credibility intervals of the Bayesian estimates include Howard estimates in most cases. They differ significantly in the PWSI where unguided harvests are the same magnitude as guided harvests and thus bias corrections made in the Bayesian model have a larger effect on those estimates.</w:t>
+        <w:t xml:space="preserve">Black rockfish harvests demonstrate an increasing trend over the time series that is dominated by guided anglers with the exception of PWSI (Figure </w:t>
+      </w:r>
+      <w:del w:id="165" w:author="Joy, Philip J (DFG)" w:date="2026-10-12T10:09:00Z" w16du:dateUtc="2026-10-12T18:09:00Z">
+        <w:r>
+          <w:delText xml:space="preserve">26 </w:delText>
+        </w:r>
+      </w:del>
+      <w:ins w:id="166" w:author="Joy, Philip J (DFG)" w:date="2026-10-12T10:09:00Z" w16du:dateUtc="2026-10-12T18:09:00Z">
+        <w:r>
+          <w:t>2</w:t>
+        </w:r>
+        <w:r>
+          <w:t>8</w:t>
+        </w:r>
+        <w:r>
+          <w:t xml:space="preserve"> </w:t>
+        </w:r>
+      </w:ins>
+      <w:r>
+        <w:t xml:space="preserve">H_BLACK, Appendix C2). Harvests prior to 1998 are generally low, but the North Gulf (NG), Northeast Kodiak, and the SSEI, NSEI and CSEO CFMU’s in Southeast had significant harvests during that time period. Guided estimates are very precise since the logbook program went into effect and port sampling programs provide </w:t>
+      </w:r>
+      <w:r>
+        <w:lastRenderedPageBreak/>
+        <w:t>robust samples for understanding the black rockfish proportion of the pelagic harvest. Unguided harvests are more uncertain as would be expected given their reliance on the SWHS estimates. Unguided estimates are similar to the Howard estimates and where they differ the credibility intervals of the Bayesian estimates include Howard estimates in most cases. They differ significantly in the PWSI where unguided harvests are the same magnitude as guided harvests and thus bias corrections made in the Bayesian model have a larger effect on those estimates.</w:t>
       </w:r>
     </w:p>
     <w:p>
@@ -31196,7 +32030,26 @@
         <w:pStyle w:val="BodyText"/>
       </w:pPr>
       <w:r>
-        <w:t>Yelloweye rockfish harvests also demonstrate increasing trends but with reductions in recent years that reflect management actions taken by the department (Figure 27 H_YE, Appendix C3). The Bayesian model demonstrates consistent and steady harvests in many CFMU’s prior to 1998 with the Southeast SSEI and CSEO demonstrating appreciable harvests. As with black rockfish, yelloweye rockfish guided harvests estimates agree with Howard estimates. Unguided yelloweye harvests were also similar to Howard estimates with the exception of the PWSI CFMU. This is the only area where private harvests are significantly greater than guided harvests and thus the effect of bias correction in the model is more pronounced. Variability in those harvests is significantly dampened in the Bayesian estimates while the overall magnitude of the harvests remains the same.</w:t>
+        <w:t xml:space="preserve">Yelloweye rockfish harvests also demonstrate increasing trends but with reductions in recent years that reflect management actions taken by the department (Figure </w:t>
+      </w:r>
+      <w:del w:id="167" w:author="Joy, Philip J (DFG)" w:date="2026-10-12T10:09:00Z" w16du:dateUtc="2026-10-12T18:09:00Z">
+        <w:r>
+          <w:delText xml:space="preserve">27 </w:delText>
+        </w:r>
+      </w:del>
+      <w:ins w:id="168" w:author="Joy, Philip J (DFG)" w:date="2026-10-12T10:09:00Z" w16du:dateUtc="2026-10-12T18:09:00Z">
+        <w:r>
+          <w:t>2</w:t>
+        </w:r>
+        <w:r>
+          <w:t>9</w:t>
+        </w:r>
+        <w:r>
+          <w:t xml:space="preserve"> </w:t>
+        </w:r>
+      </w:ins>
+      <w:r>
+        <w:t>H_YE, Appendix C3). The Bayesian model demonstrates consistent and steady harvests in many CFMU’s prior to 1998 with the Southeast SSEI and CSEO demonstrating appreciable harvests. As with black rockfish, yelloweye rockfish guided harvests estimates agree with Howard estimates. Unguided yelloweye harvests were also similar to Howard estimates with the exception of the PWSI CFMU. This is the only area where private harvests are significantly greater than guided harvests and thus the effect of bias correction in the model is more pronounced. Variability in those harvests is significantly dampened in the Bayesian estimates while the overall magnitude of the harvests remains the same.</w:t>
       </w:r>
     </w:p>
     <w:p>
@@ -31204,7 +32057,31 @@
         <w:pStyle w:val="BodyText"/>
       </w:pPr>
       <w:r>
-        <w:t>Yelloweye rockfish harvests in the BSAI and SOKO2SAP areas of Kodiak have extremely large credibility intervals owing to a lack of area-specific data for these areas. Yelloweye harvests are generally low in the Kodiak region and portside samples are lacking, even for the most heavily fished Northeast and Afognak units. As such, the proportion of non-yelloweye harvests that are yelloweye have credibility intervals for 4 of the 6 Kodiak units ranging from 0 to 1 (Figure YE_COMP) with this uncertainty propagated through the harvest and release calculations. Harvest and total removal point estimates for these regions are very low (Figure YE_HARV, YE_REMOVALS) and even the upper end of the credibility intervals are relatively low. Although imprecise, these estimates provide managers with information on the scale and trend of harvests in these areas.</w:t>
+        <w:t xml:space="preserve">Yelloweye rockfish harvests in the BSAI and SOKO2SAP areas of Kodiak have extremely large credibility intervals owing to a lack of area-specific data for these areas. Yelloweye harvests are generally low in the Kodiak region and portside samples are lacking, even for the most heavily fished Northeast and Afognak units. As such, the proportion of non-yelloweye harvests that are yelloweye have credibility intervals for 4 of the 6 Kodiak units ranging from 0 to 1 (Figure </w:t>
+      </w:r>
+      <w:ins w:id="169" w:author="Joy, Philip J (DFG)" w:date="2026-10-12T10:10:00Z" w16du:dateUtc="2026-10-12T18:10:00Z">
+        <w:r>
+          <w:t xml:space="preserve">23 </w:t>
+        </w:r>
+      </w:ins>
+      <w:r>
+        <w:t xml:space="preserve">YE_COMP) with this uncertainty propagated through the harvest and release calculations. Harvest and total removal point estimates for these regions are very low (Figure </w:t>
+      </w:r>
+      <w:ins w:id="170" w:author="Joy, Philip J (DFG)" w:date="2026-10-12T10:11:00Z" w16du:dateUtc="2026-10-12T18:11:00Z">
+        <w:r>
+          <w:t xml:space="preserve">29 </w:t>
+        </w:r>
+      </w:ins>
+      <w:r>
+        <w:t>YE_HARV</w:t>
+      </w:r>
+      <w:del w:id="171" w:author="Joy, Philip J (DFG)" w:date="2026-10-12T10:11:00Z" w16du:dateUtc="2026-10-12T18:11:00Z">
+        <w:r>
+          <w:delText>, YE_REMOVALS</w:delText>
+        </w:r>
+      </w:del>
+      <w:r>
+        <w:t>) and even the upper end of the credibility intervals are relatively low. Although imprecise, these estimates provide managers with information on the scale and trend of harvests in these areas.</w:t>
       </w:r>
     </w:p>
     <w:p>
@@ -31212,8 +32089,39 @@
         <w:pStyle w:val="BodyText"/>
       </w:pPr>
       <w:r>
-        <w:lastRenderedPageBreak/>
-        <w:t xml:space="preserve">Non-yelloweye DSR harvests in Southeast show very similar patterns to yelloweye and strong agreement with Howard estimates (Figure 28 H_DSR and Appendix C4) and slope rockfish harvests show an increasing trend that is less pronounced than the other species and complexes (Figure 29 H_SLOPE and Appendix C5). Although slope </w:t>
+        <w:t xml:space="preserve">Non-yelloweye DSR harvests in Southeast show very similar patterns to yelloweye and strong agreement with Howard estimates (Figure </w:t>
+      </w:r>
+      <w:del w:id="172" w:author="Joy, Philip J (DFG)" w:date="2026-10-12T10:11:00Z" w16du:dateUtc="2026-10-12T18:11:00Z">
+        <w:r>
+          <w:delText xml:space="preserve">28 </w:delText>
+        </w:r>
+      </w:del>
+      <w:ins w:id="173" w:author="Joy, Philip J (DFG)" w:date="2026-10-12T10:11:00Z" w16du:dateUtc="2026-10-12T18:11:00Z">
+        <w:r>
+          <w:t>30</w:t>
+        </w:r>
+        <w:r>
+          <w:t xml:space="preserve"> </w:t>
+        </w:r>
+      </w:ins>
+      <w:r>
+        <w:t xml:space="preserve">H_DSR and Appendix C4) and slope rockfish harvests show an increasing trend that is less pronounced than the other species and complexes (Figure </w:t>
+      </w:r>
+      <w:del w:id="174" w:author="Joy, Philip J (DFG)" w:date="2026-10-12T10:11:00Z" w16du:dateUtc="2026-10-12T18:11:00Z">
+        <w:r>
+          <w:delText xml:space="preserve">29 </w:delText>
+        </w:r>
+      </w:del>
+      <w:ins w:id="175" w:author="Joy, Philip J (DFG)" w:date="2026-10-12T10:11:00Z" w16du:dateUtc="2026-10-12T18:11:00Z">
+        <w:r>
+          <w:t>31</w:t>
+        </w:r>
+        <w:r>
+          <w:t xml:space="preserve"> </w:t>
+        </w:r>
+      </w:ins>
+      <w:r>
+        <w:t xml:space="preserve">H_SLOPE and Appendix C5). Although slope </w:t>
       </w:r>
       <w:r>
         <w:rPr>
@@ -31230,8 +32138,8 @@
       <w:pPr>
         <w:pStyle w:val="Heading3"/>
       </w:pPr>
-      <w:bookmarkStart w:id="58" w:name="releases-2"/>
-      <w:bookmarkEnd w:id="57"/>
+      <w:bookmarkStart w:id="176" w:name="releases-2"/>
+      <w:bookmarkEnd w:id="162"/>
       <w:r>
         <w:t>Releases</w:t>
       </w:r>
@@ -31241,7 +32149,30 @@
         <w:pStyle w:val="FirstParagraph"/>
       </w:pPr>
       <w:r>
-        <w:t>The release estimates for all rockfish are substantially less than harvests and demonstrate variable trends over the course of the time series with substantial uncertainty in the estimates (Figure 30 R_ALL and Appendix C1). Estimates from the pre-1998 period were sometimes similar to the low end of the post-1998 period or demonstrated an increase as the fishery in that CFMU developed. The trends in the Bayesian model diverge from the Howard estimates more than the harvest estimates due to changes in methodology, including the integration of the portside interview data. Portside interview data in Southcentral and the Northeast Kodiak CFMUs showed much lower retention probabilities for private anglers which greatly increased the release estimates in this region relative to the Howard estimates. In the Southeast region the release estimates are generally in line with the Howard estimates but are significantly lower in the early 2000s when the Howard methods relied on assumptions and long-term averages to compensate for the lack of logbook data on yelloweye releases (Figure DATA).</w:t>
+        <w:t xml:space="preserve">The release estimates for all rockfish are substantially less than harvests and demonstrate variable trends over the course of the time series with substantial uncertainty in the estimates (Figure </w:t>
+      </w:r>
+      <w:del w:id="177" w:author="Joy, Philip J (DFG)" w:date="2026-10-12T10:11:00Z" w16du:dateUtc="2026-10-12T18:11:00Z">
+        <w:r>
+          <w:delText xml:space="preserve">30 </w:delText>
+        </w:r>
+      </w:del>
+      <w:ins w:id="178" w:author="Joy, Philip J (DFG)" w:date="2026-10-12T10:11:00Z" w16du:dateUtc="2026-10-12T18:11:00Z">
+        <w:r>
+          <w:t>3</w:t>
+        </w:r>
+        <w:r>
+          <w:t>2</w:t>
+        </w:r>
+        <w:r>
+          <w:t xml:space="preserve"> </w:t>
+        </w:r>
+      </w:ins>
+      <w:r>
+        <w:t xml:space="preserve">R_ALL and Appendix C1). Estimates from the pre-1998 period were sometimes similar to the low end of the post-1998 period or demonstrated an increase as the fishery in that CFMU developed. The trends in the Bayesian model diverge from the Howard estimates more than the harvest estimates due to changes in methodology, including the integration of the portside interview data. Portside interview data in Southcentral and the Northeast Kodiak CFMUs showed much lower retention probabilities for private anglers which greatly increased the release estimates in this region relative to the Howard estimates. In the Southeast region the release estimates are generally in line with the Howard estimates but are significantly lower in the early 2000s when the Howard </w:t>
+      </w:r>
+      <w:r>
+        <w:lastRenderedPageBreak/>
+        <w:t>methods relied on assumptions and long-term averages to compensate for the lack of logbook data on yelloweye releases (Figure DATA).</w:t>
       </w:r>
     </w:p>
     <w:p>
@@ -31249,7 +32180,45 @@
         <w:pStyle w:val="BodyText"/>
       </w:pPr>
       <w:r>
-        <w:t xml:space="preserve">Releases of black rockfish demonstrate a relatively steady trend with an increase for guided anglers in the early 2000s as anglers began to target the species and then a decline as guided angler retention increased (Figure 31 R_BLACK, Figure 15 PEL_pH, Appendix C2). Unguided anglers show a gradual increase in releases that mirrors the overall increased participation in the fishery. Estimates of guided releases are very precise since 1998 owing to logbook records and adequate sampling in the port sampling program. Prior to 1998, guided release estimates demonstrate significant uncertainty. Owing to less informative data estimates of unguided releases have substantial uncertainty as a result of data specific to unguided release numbers and the reliance on the </w:t>
+        <w:t xml:space="preserve">Releases of black rockfish demonstrate a relatively steady trend with an increase for guided anglers in the early 2000s as anglers began to target the species and then a decline as guided angler retention increased (Figure </w:t>
+      </w:r>
+      <w:del w:id="179" w:author="Joy, Philip J (DFG)" w:date="2026-10-12T10:12:00Z" w16du:dateUtc="2026-10-12T18:12:00Z">
+        <w:r>
+          <w:delText xml:space="preserve">31 </w:delText>
+        </w:r>
+      </w:del>
+      <w:ins w:id="180" w:author="Joy, Philip J (DFG)" w:date="2026-10-12T10:12:00Z" w16du:dateUtc="2026-10-12T18:12:00Z">
+        <w:r>
+          <w:t>3</w:t>
+        </w:r>
+        <w:r>
+          <w:t>3</w:t>
+        </w:r>
+        <w:r>
+          <w:t xml:space="preserve"> </w:t>
+        </w:r>
+      </w:ins>
+      <w:r>
+        <w:t xml:space="preserve">R_BLACK, Figure </w:t>
+      </w:r>
+      <w:del w:id="181" w:author="Joy, Philip J (DFG)" w:date="2026-10-12T10:12:00Z" w16du:dateUtc="2026-10-12T18:12:00Z">
+        <w:r>
+          <w:delText xml:space="preserve">15 </w:delText>
+        </w:r>
+      </w:del>
+      <w:ins w:id="182" w:author="Joy, Philip J (DFG)" w:date="2026-10-12T10:12:00Z" w16du:dateUtc="2026-10-12T18:12:00Z">
+        <w:r>
+          <w:t>1</w:t>
+        </w:r>
+        <w:r>
+          <w:t>6</w:t>
+        </w:r>
+        <w:r>
+          <w:t xml:space="preserve"> </w:t>
+        </w:r>
+      </w:ins>
+      <w:r>
+        <w:t xml:space="preserve">PEL_pH, Appendix C2). Unguided anglers show a gradual increase in releases that mirrors the overall increased participation in the fishery. Estimates of guided releases are very precise since 1998 owing to logbook records and adequate sampling in the port sampling program. Prior to 1998, guided release estimates demonstrate significant uncertainty. Owing to less informative data estimates of unguided releases have substantial uncertainty as a result of data specific to unguided release numbers and the reliance on the </w:t>
       </w:r>
       <w:r>
         <w:rPr>
@@ -31267,7 +32236,45 @@
         <w:pStyle w:val="BodyText"/>
       </w:pPr>
       <w:r>
-        <w:t>Yelloweye release estimates demonstrated fairly steady trends with pronounced uncertainty around the unguided estimates (Figure 32 R_YE and Appendix C3). Retention of yelloweye rockfish has historically been high (Figure 16 YE_pH) and the overall release estimates are generally low. Unguided release estimates also differ substantially from the Howard estimates but, unlike black rockfish, are sometime higher and sometimes lower. In almost all cases the credibility intervals from the Bayesian model include the Howard estimates.</w:t>
+        <w:t xml:space="preserve">Yelloweye release estimates demonstrated fairly steady trends with pronounced uncertainty around the unguided estimates (Figure </w:t>
+      </w:r>
+      <w:del w:id="183" w:author="Joy, Philip J (DFG)" w:date="2026-10-12T10:13:00Z" w16du:dateUtc="2026-10-12T18:13:00Z">
+        <w:r>
+          <w:delText xml:space="preserve">32 </w:delText>
+        </w:r>
+      </w:del>
+      <w:ins w:id="184" w:author="Joy, Philip J (DFG)" w:date="2026-10-12T10:13:00Z" w16du:dateUtc="2026-10-12T18:13:00Z">
+        <w:r>
+          <w:t>3</w:t>
+        </w:r>
+        <w:r>
+          <w:t>4</w:t>
+        </w:r>
+        <w:r>
+          <w:t xml:space="preserve"> </w:t>
+        </w:r>
+      </w:ins>
+      <w:r>
+        <w:t xml:space="preserve">R_YE and Appendix C3). Retention of yelloweye rockfish has historically been high (Figure </w:t>
+      </w:r>
+      <w:del w:id="185" w:author="Joy, Philip J (DFG)" w:date="2026-10-12T10:13:00Z" w16du:dateUtc="2026-10-12T18:13:00Z">
+        <w:r>
+          <w:delText xml:space="preserve">16 </w:delText>
+        </w:r>
+      </w:del>
+      <w:ins w:id="186" w:author="Joy, Philip J (DFG)" w:date="2026-10-12T10:13:00Z" w16du:dateUtc="2026-10-12T18:13:00Z">
+        <w:r>
+          <w:t>1</w:t>
+        </w:r>
+        <w:r>
+          <w:t>7</w:t>
+        </w:r>
+        <w:r>
+          <w:t xml:space="preserve"> </w:t>
+        </w:r>
+      </w:ins>
+      <w:r>
+        <w:t>YE_pH) and the overall release estimates are generally low. Unguided release estimates also differ substantially from the Howard estimates but, unlike black rockfish, are sometime higher and sometimes lower. In almost all cases the credibility intervals from the Bayesian model include the Howard estimates.</w:t>
       </w:r>
     </w:p>
     <w:p>
@@ -31275,19 +32282,53 @@
         <w:pStyle w:val="BodyText"/>
       </w:pPr>
       <w:r>
-        <w:t xml:space="preserve">Non-yelloweye DSR demonstrated similar release patterns to yelloweye rockfish and lower unguided estimates than Howard (Figure R_DSR 33 and Appendix C4) while slope rockfish show very low release numbers for most of the time series and a large, uptick in recent years with substantial uncertainty (R_SLOPE 34 and Appendix C5). While the DSR estimates track the Howard estimates to a fair degree, the slope rockfish estimates are substantially higher in the SSEO </w:t>
-      </w:r>
-      <w:r>
-        <w:lastRenderedPageBreak/>
-        <w:t>and, to a lesser degree, the NSEI and EWYKT, although the overall number is still low and not likely to be a management concern.</w:t>
+        <w:t xml:space="preserve">Non-yelloweye DSR demonstrated similar release patterns to yelloweye rockfish and lower unguided estimates than Howard (Figure R_DSR </w:t>
+      </w:r>
+      <w:del w:id="187" w:author="Joy, Philip J (DFG)" w:date="2026-10-12T10:13:00Z" w16du:dateUtc="2026-10-12T18:13:00Z">
+        <w:r>
+          <w:delText xml:space="preserve">33 </w:delText>
+        </w:r>
+      </w:del>
+      <w:ins w:id="188" w:author="Joy, Philip J (DFG)" w:date="2026-10-12T10:13:00Z" w16du:dateUtc="2026-10-12T18:13:00Z">
+        <w:r>
+          <w:t>3</w:t>
+        </w:r>
+        <w:r>
+          <w:t>5</w:t>
+        </w:r>
+        <w:r>
+          <w:t xml:space="preserve"> </w:t>
+        </w:r>
+      </w:ins>
+      <w:r>
+        <w:t xml:space="preserve">and Appendix C4) while slope rockfish show very low release numbers for most of the time series and a large, uptick in recent years with substantial uncertainty (R_SLOPE </w:t>
+      </w:r>
+      <w:del w:id="189" w:author="Joy, Philip J (DFG)" w:date="2026-10-12T10:13:00Z" w16du:dateUtc="2026-10-12T18:13:00Z">
+        <w:r>
+          <w:delText xml:space="preserve">34 </w:delText>
+        </w:r>
+      </w:del>
+      <w:ins w:id="190" w:author="Joy, Philip J (DFG)" w:date="2026-10-12T10:13:00Z" w16du:dateUtc="2026-10-12T18:13:00Z">
+        <w:r>
+          <w:t>3</w:t>
+        </w:r>
+        <w:r>
+          <w:t>6</w:t>
+        </w:r>
+        <w:r>
+          <w:t xml:space="preserve"> </w:t>
+        </w:r>
+      </w:ins>
+      <w:r>
+        <w:t>and Appendix C5). While the DSR estimates track the Howard estimates to a fair degree, the slope rockfish estimates are substantially higher in the SSEO and, to a lesser degree, the NSEI and EWYKT, although the overall number is still low and not likely to be a management concern.</w:t>
       </w:r>
     </w:p>
     <w:p>
       <w:pPr>
         <w:pStyle w:val="Heading3"/>
       </w:pPr>
-      <w:bookmarkStart w:id="59" w:name="total-removals-in-biomass"/>
-      <w:bookmarkEnd w:id="58"/>
+      <w:bookmarkStart w:id="191" w:name="total-removals-in-biomass"/>
+      <w:bookmarkEnd w:id="176"/>
       <w:r>
         <w:t>Total Removals in Biomass</w:t>
       </w:r>
@@ -31297,29 +32338,135 @@
         <w:pStyle w:val="FirstParagraph"/>
       </w:pPr>
       <w:r>
-        <w:t>After factoring in release mortalities and converting to biomass total removals of rockfish in sport fisheries were calculated for Southcentral and Kodiak regions. The release mortality rate for pelagic and black rockfish is relatively low even before the introduction of DWRs and coupled with high retention in recent years, release mortalities represent a trivial component of overall fishery removals (Figure 35 BRF_M, 37 PEL_M, Appendix B1 and B6). DSR (including yelloweye) and slope rockfish assemblages experienced high release mortality prior to DRM requirements and even with DWR experience appreciable mortality rates (Figure 8 REL_M). As such, release mortalities comprised a modest but appreciable contribution to overall mortalities for these species (Figure 36, 38 and 39 YE_M, DRS_M and SLOPE_M, Appendix C3, C4 and C5).</w:t>
+        <w:t xml:space="preserve">After factoring in release mortalities and converting to biomass total removals of rockfish in sport fisheries were calculated for Southcentral and Kodiak regions. The release mortality rate for pelagic and black rockfish is relatively low even before the introduction of DWRs and coupled with high retention in recent years, release mortalities represent a trivial component of overall fishery removals (Figure </w:t>
+      </w:r>
+      <w:del w:id="192" w:author="Joy, Philip J (DFG)" w:date="2026-10-12T10:13:00Z" w16du:dateUtc="2026-10-12T18:13:00Z">
+        <w:r>
+          <w:delText xml:space="preserve">35 </w:delText>
+        </w:r>
+      </w:del>
+      <w:ins w:id="193" w:author="Joy, Philip J (DFG)" w:date="2026-10-12T10:13:00Z" w16du:dateUtc="2026-10-12T18:13:00Z">
+        <w:r>
+          <w:t>3</w:t>
+        </w:r>
+        <w:r>
+          <w:t>7</w:t>
+        </w:r>
+        <w:r>
+          <w:t xml:space="preserve"> </w:t>
+        </w:r>
+      </w:ins>
+      <w:r>
+        <w:t xml:space="preserve">BRF_M, </w:t>
+      </w:r>
+      <w:del w:id="194" w:author="Joy, Philip J (DFG)" w:date="2026-10-12T10:14:00Z" w16du:dateUtc="2026-10-12T18:14:00Z">
+        <w:r>
+          <w:delText xml:space="preserve">37 </w:delText>
+        </w:r>
+      </w:del>
+      <w:ins w:id="195" w:author="Joy, Philip J (DFG)" w:date="2026-10-12T10:14:00Z" w16du:dateUtc="2026-10-12T18:14:00Z">
+        <w:r>
+          <w:t>3</w:t>
+        </w:r>
+        <w:r>
+          <w:t>8</w:t>
+        </w:r>
+        <w:r>
+          <w:t xml:space="preserve"> </w:t>
+        </w:r>
+      </w:ins>
+      <w:r>
+        <w:t xml:space="preserve">PEL_M, Appendix B1 and B6). DSR (including yelloweye) and slope rockfish assemblages experienced high release mortality prior to DRM requirements and even with DWR experience appreciable mortality rates (Figure </w:t>
+      </w:r>
+      <w:del w:id="196" w:author="Joy, Philip J (DFG)" w:date="2026-10-12T10:14:00Z" w16du:dateUtc="2026-10-12T18:14:00Z">
+        <w:r>
+          <w:delText xml:space="preserve">8 </w:delText>
+        </w:r>
+      </w:del>
+      <w:ins w:id="197" w:author="Joy, Philip J (DFG)" w:date="2026-10-12T10:14:00Z" w16du:dateUtc="2026-10-12T18:14:00Z">
+        <w:r>
+          <w:t>7</w:t>
+        </w:r>
+        <w:r>
+          <w:t xml:space="preserve"> </w:t>
+        </w:r>
+      </w:ins>
+      <w:r>
+        <w:t xml:space="preserve">REL_M). As such, release mortalities comprised a modest but appreciable contribution to overall mortalities for these species (Figure </w:t>
+      </w:r>
+      <w:del w:id="198" w:author="Joy, Philip J (DFG)" w:date="2026-10-12T10:15:00Z" w16du:dateUtc="2026-10-12T18:15:00Z">
+        <w:r>
+          <w:delText>36</w:delText>
+        </w:r>
+      </w:del>
+      <w:ins w:id="199" w:author="Joy, Philip J (DFG)" w:date="2026-10-12T10:15:00Z" w16du:dateUtc="2026-10-12T18:15:00Z">
+        <w:r>
+          <w:t>3</w:t>
+        </w:r>
+        <w:r>
+          <w:t>9</w:t>
+        </w:r>
+      </w:ins>
+      <w:r>
+        <w:t xml:space="preserve">, </w:t>
+      </w:r>
+      <w:del w:id="200" w:author="Joy, Philip J (DFG)" w:date="2026-10-12T10:15:00Z" w16du:dateUtc="2026-10-12T18:15:00Z">
+        <w:r>
+          <w:delText xml:space="preserve">38 </w:delText>
+        </w:r>
+      </w:del>
+      <w:ins w:id="201" w:author="Joy, Philip J (DFG)" w:date="2026-10-12T10:15:00Z" w16du:dateUtc="2026-10-12T18:15:00Z">
+        <w:r>
+          <w:t>40</w:t>
+        </w:r>
+        <w:r>
+          <w:t xml:space="preserve"> </w:t>
+        </w:r>
+      </w:ins>
+      <w:r>
+        <w:t xml:space="preserve">and </w:t>
+      </w:r>
+      <w:del w:id="202" w:author="Joy, Philip J (DFG)" w:date="2026-10-12T10:15:00Z" w16du:dateUtc="2026-10-12T18:15:00Z">
+        <w:r>
+          <w:delText xml:space="preserve">39 </w:delText>
+        </w:r>
+      </w:del>
+      <w:ins w:id="203" w:author="Joy, Philip J (DFG)" w:date="2026-10-12T10:15:00Z" w16du:dateUtc="2026-10-12T18:15:00Z">
+        <w:r>
+          <w:t>41</w:t>
+        </w:r>
+        <w:r>
+          <w:t xml:space="preserve"> </w:t>
+        </w:r>
+      </w:ins>
+      <w:r>
+        <w:t>YE_M, DRS_M and SLOPE_M, Appendix C3, C4 and C5).</w:t>
       </w:r>
     </w:p>
     <w:p>
       <w:pPr>
         <w:pStyle w:val="Heading1"/>
       </w:pPr>
-      <w:bookmarkStart w:id="60" w:name="_Toc242361802"/>
-      <w:bookmarkStart w:id="61" w:name="discussion"/>
-      <w:bookmarkEnd w:id="39"/>
-      <w:bookmarkEnd w:id="56"/>
-      <w:bookmarkEnd w:id="59"/>
+      <w:bookmarkStart w:id="204" w:name="_Toc242361802"/>
+      <w:bookmarkStart w:id="205" w:name="discussion"/>
+      <w:bookmarkEnd w:id="80"/>
+      <w:bookmarkEnd w:id="161"/>
+      <w:bookmarkEnd w:id="191"/>
       <w:r>
         <w:t>Discussion</w:t>
       </w:r>
-      <w:bookmarkEnd w:id="60"/>
+      <w:bookmarkEnd w:id="204"/>
     </w:p>
     <w:p>
       <w:pPr>
         <w:pStyle w:val="FirstParagraph"/>
       </w:pPr>
       <w:r>
-        <w:t>The Bayesian approach to reconstructing historical rockfish removals and calculating current rockfish removals build and improve on the foundation established by Howard et al. (2020). This new approach offers unified methods that encompasses all of the necessary steps to go from the SWHS, logbook and port sampling data to produce estimates of harvests, releases and total biomass removal estimates necessary to conduct stock assessments. These methods are reproducible and offer the first documentation of the biomass and mortality calculations that have been used since the Howard methods were first adopted. This will provide greater consistency and transparency in accounting for rockfish removals in Alaska waters. These methods improve on the Howard methodology by accurately addressing bias in the SWHS data, models the release data in a more realistic process, uses hierarchical modelling to deal with low or absent samples, and generates a time series back to 1977 by utilizing all available data.</w:t>
+        <w:t xml:space="preserve">The Bayesian approach to reconstructing historical rockfish removals and calculating current rockfish removals build and improve on the foundation established by Howard et al. (2020). This new approach offers unified methods that encompasses all of the necessary steps to go from the </w:t>
+      </w:r>
+      <w:r>
+        <w:lastRenderedPageBreak/>
+        <w:t>SWHS, logbook and port sampling data to produce estimates of harvests, releases and total biomass removal estimates necessary to conduct stock assessments. These methods are reproducible and offer the first documentation of the biomass and mortality calculations that have been used since the Howard methods were first adopted. This will provide greater consistency and transparency in accounting for rockfish removals in Alaska waters. These methods improve on the Howard methodology by accurately addressing bias in the SWHS data, models the release data in a more realistic process, uses hierarchical modelling to deal with low or absent samples, and generates a time series back to 1977 by utilizing all available data.</w:t>
       </w:r>
     </w:p>
     <w:p>
@@ -31335,11 +32482,45 @@
         <w:pStyle w:val="BodyText"/>
       </w:pPr>
       <w:r>
-        <w:t xml:space="preserve">The Bayesian approach to estimating releases produces noticeably different estimates from the Howard approach, particularly for the unguided sector. The Howard approach uses the same methods for estimating unguided releases as it does for harvests as it applies the SWHS ratio of guided:unguided release of all rockfish to the logbook release data. However, the Howard methods do not address bias in those estimates, assumes the ratio is equal for all species, and do not make use of the portside interview data. In contrast to SWHS harvest estimates, SWHS release estimates are biased high (i.e., anglers over-report their releases relative to logbook data) with a much larger magnitude in the bias relative to harvests. Rather than multiplying the logbook release estimates by the unguided:guided ratio of releases in the SWHS data, the Bayesian model corrects the SWHS release estimates and ensures that releases of the three logbook categories sum to that value, </w:t>
-      </w:r>
-      <w:r>
-        <w:lastRenderedPageBreak/>
-        <w:t>ensuring a more process and data driven estimation procedure. In many cases the Howard method results in unguided release estimates that are at or above guided release estimates even when the harvest of unguided anglers is substantially less (Figures 26 H_BLACK and 31 R_BLACK). This would imply that unguided anglers are discarding fish at a far higher rate than guided anglers.</w:t>
+        <w:t xml:space="preserve">The Bayesian approach to estimating releases produces noticeably different estimates from the Howard approach, particularly for the unguided sector. The Howard approach uses the same methods for estimating unguided releases as it does for harvests as it applies the SWHS ratio of guided:unguided release of all rockfish to the logbook release data. However, the Howard methods do not address bias in those estimates, assumes the ratio is equal for all species, and do not make use of the portside interview data. In contrast to SWHS harvest estimates, SWHS release estimates are biased high (i.e., anglers over-report their releases relative to logbook data) with a much larger magnitude in the bias relative to harvests. Rather than multiplying the logbook release estimates by the unguided:guided ratio of releases in the SWHS data, the Bayesian model corrects the SWHS release estimates and ensures that releases of the three logbook categories sum to that value, ensuring a more process and data driven estimation procedure. In many cases the Howard method results in unguided release estimates that are at or above guided release estimates even when the harvest of unguided anglers is substantially less (Figures </w:t>
+      </w:r>
+      <w:del w:id="206" w:author="Joy, Philip J (DFG)" w:date="2026-10-12T10:16:00Z" w16du:dateUtc="2026-10-12T18:16:00Z">
+        <w:r>
+          <w:delText xml:space="preserve">26 </w:delText>
+        </w:r>
+      </w:del>
+      <w:ins w:id="207" w:author="Joy, Philip J (DFG)" w:date="2026-10-12T10:16:00Z" w16du:dateUtc="2026-10-12T18:16:00Z">
+        <w:r>
+          <w:t>2</w:t>
+        </w:r>
+        <w:r>
+          <w:t>8</w:t>
+        </w:r>
+        <w:r>
+          <w:t xml:space="preserve"> </w:t>
+        </w:r>
+      </w:ins>
+      <w:r>
+        <w:t xml:space="preserve">H_BLACK and </w:t>
+      </w:r>
+      <w:del w:id="208" w:author="Joy, Philip J (DFG)" w:date="2026-10-12T10:16:00Z" w16du:dateUtc="2026-10-12T18:16:00Z">
+        <w:r>
+          <w:delText xml:space="preserve">31 </w:delText>
+        </w:r>
+      </w:del>
+      <w:ins w:id="209" w:author="Joy, Philip J (DFG)" w:date="2026-10-12T10:16:00Z" w16du:dateUtc="2026-10-12T18:16:00Z">
+        <w:r>
+          <w:t>3</w:t>
+        </w:r>
+        <w:r>
+          <w:t>3</w:t>
+        </w:r>
+        <w:r>
+          <w:t xml:space="preserve"> </w:t>
+        </w:r>
+      </w:ins>
+      <w:r>
+        <w:t>R_BLACK). This would imply that unguided anglers are discarding fish at a far higher rate than guided anglers.</w:t>
       </w:r>
     </w:p>
     <w:p>
@@ -31355,6 +32536,7 @@
         <w:pStyle w:val="BodyText"/>
       </w:pPr>
       <w:r>
+        <w:lastRenderedPageBreak/>
         <w:t>The Bayesian approach is not without flaws and required making an assumption that retention probabilities have followed similar trends in both user groups. Projecting release estimates back in time required relating releases to the harvest data and necessitated estimating retention probability (</w:t>
       </w:r>
       <w:r>
@@ -31461,11 +32643,7 @@
         </m:sSub>
       </m:oMath>
       <w:r>
-        <w:t xml:space="preserve"> has changed </w:t>
-      </w:r>
-      <w:r>
-        <w:lastRenderedPageBreak/>
-        <w:t>significantly it would affect the estimates in the model and thus remains a question mark in the approach. If data were to become available the model could be updated to produce more accurate estimates, but in the absence of that data it is hoped that credibility intervals capture the true values.</w:t>
+        <w:t xml:space="preserve"> has changed significantly it would affect the estimates in the model and thus remains a question mark in the approach. If data were to become available the model could be updated to produce more accurate estimates, but in the absence of that data it is hoped that credibility intervals capture the true values.</w:t>
       </w:r>
     </w:p>
     <w:p>
@@ -31514,7 +32692,23 @@
         </m:sSub>
       </m:oMath>
       <w:r>
-        <w:t xml:space="preserve">) were generally consistent between port samples and logbook data in all areas except Prince William Sound where port samples suggest a lower proportion than the logbook data (Figure 18 P_PEL). Howard et al. (2020) identified issues with the representativeness of the port samples in relation to the harvests. Consequently, that data has been weighted according to their methods although the issue remains even with the adjusted data. The discrepancy between the logbook and port sampling data may be a byproduct of the proportion of fish that are cleaned at sea and not brought to port where they can be sampled. The proportion of rockfish cleaned at sea in Prince William Sound can be as high as 73% of rockfish reported in interviews out of Whittier and if pelagic rockfish (which have historically had a higher bag limit that non-pelagic species) are more likely to be cleaned at sea than non-pelagic rockfish the lower </w:t>
+        <w:t xml:space="preserve">) were generally consistent between port samples and logbook data in all areas except Prince William Sound where port samples suggest a lower proportion than the logbook data (Figure </w:t>
+      </w:r>
+      <w:del w:id="210" w:author="Joy, Philip J (DFG)" w:date="2026-10-12T10:17:00Z" w16du:dateUtc="2026-10-12T18:17:00Z">
+        <w:r>
+          <w:delText xml:space="preserve">18 </w:delText>
+        </w:r>
+      </w:del>
+      <w:ins w:id="211" w:author="Joy, Philip J (DFG)" w:date="2026-10-12T10:17:00Z" w16du:dateUtc="2026-10-12T18:17:00Z">
+        <w:r>
+          <w:t>21</w:t>
+        </w:r>
+        <w:r>
+          <w:t xml:space="preserve"> </w:t>
+        </w:r>
+      </w:ins>
+      <w:r>
+        <w:t xml:space="preserve">P_PEL). Howard et al. (2020) identified issues with the representativeness of the port samples in relation to the harvests. Consequently, that data has been weighted according to their methods although the issue remains even with the adjusted data. The discrepancy between the logbook and port sampling data may be a byproduct of the proportion of fish that are cleaned at sea and not brought to port where they can be sampled. The proportion of rockfish cleaned at sea in Prince William Sound can be as high as 73% of rockfish reported in interviews out of Whittier and if pelagic rockfish (which have historically had a higher bag limit that non-pelagic species) are more likely to be cleaned at sea than non-pelagic rockfish the lower </w:t>
       </w:r>
       <m:oMath>
         <m:sSub>
@@ -31596,15 +32790,71 @@
         </m:sSub>
       </m:oMath>
       <w:r>
-        <w:t xml:space="preserve"> while the logistic curve appears to capture the uncertainty in pre-logbook estimates. However, the cause of the discrepancy remains unclear and a reevaluation of the Prince William Sound port sampling estimates is recommended. Improving port sampling procedures and regulations may help to better understand these discrepancies.</w:t>
+        <w:t xml:space="preserve"> while the logistic curve appears to capture the uncertainty in pre-logbook estimates. However, the cause of the discrepancy remains unclear and a reevaluation of the Prince William </w:t>
+      </w:r>
+      <w:r>
+        <w:lastRenderedPageBreak/>
+        <w:t>Sound port sampling estimates is recommended. Improving port sampling procedures and regulations may help to better understand these discrepancies.</w:t>
       </w:r>
     </w:p>
     <w:p>
       <w:pPr>
         <w:pStyle w:val="BodyText"/>
       </w:pPr>
-      <w:r>
-        <w:t>The discrepancy in the release of non-yelloweye DSR and slope rockfish in the SSEO portside sampling and logbook data also bears attention. In particular, logbooks record low retention of “other” rockfish while portside interviews indicate high retention. Area biologists should investigate this data discrepancy to determine if species identification or systematic under- or overreporting in logbooks is contributing to the contradictory data.</w:t>
+      <w:ins w:id="212" w:author="Joy, Philip J (DFG)" w:date="2026-10-12T08:52:00Z" w16du:dateUtc="2026-10-12T16:52:00Z">
+        <w:r>
+          <w:t xml:space="preserve">Release estimates of DSR and slope rockfish in Southeast Alaska </w:t>
+        </w:r>
+      </w:ins>
+      <w:ins w:id="213" w:author="Joy, Philip J (DFG)" w:date="2026-10-12T08:53:00Z" w16du:dateUtc="2026-10-12T16:53:00Z">
+        <w:r>
+          <w:t xml:space="preserve">diverge from the raw data and should be viewed with caution. </w:t>
+        </w:r>
+      </w:ins>
+      <w:r>
+        <w:t>The</w:t>
+      </w:r>
+      <w:ins w:id="214" w:author="Joy, Philip J (DFG)" w:date="2026-10-12T08:55:00Z" w16du:dateUtc="2026-10-12T16:55:00Z">
+        <w:r>
+          <w:t>re is significant</w:t>
+        </w:r>
+      </w:ins>
+      <w:r>
+        <w:t xml:space="preserve"> discrepancy in the release of non-yelloweye DSR and slope rockfish in the SSEO </w:t>
+      </w:r>
+      <w:ins w:id="215" w:author="Joy, Philip J (DFG)" w:date="2026-10-12T08:54:00Z" w16du:dateUtc="2026-10-12T16:54:00Z">
+        <w:r>
+          <w:t xml:space="preserve">and NSEI </w:t>
+        </w:r>
+      </w:ins>
+      <w:ins w:id="216" w:author="Joy, Philip J (DFG)" w:date="2026-10-12T08:55:00Z" w16du:dateUtc="2026-10-12T16:55:00Z">
+        <w:r>
+          <w:t xml:space="preserve">between the </w:t>
+        </w:r>
+      </w:ins>
+      <w:r>
+        <w:t>portside sampling and logbook data</w:t>
+      </w:r>
+      <w:del w:id="217" w:author="Joy, Philip J (DFG)" w:date="2026-10-12T08:55:00Z" w16du:dateUtc="2026-10-12T16:55:00Z">
+        <w:r>
+          <w:delText xml:space="preserve"> also bears attention</w:delText>
+        </w:r>
+      </w:del>
+      <w:r>
+        <w:t xml:space="preserve">. In particular, logbooks record low retention of “other” rockfish while portside interviews indicate high retention. </w:t>
+      </w:r>
+      <w:ins w:id="218" w:author="Joy, Philip J (DFG)" w:date="2026-10-12T08:56:00Z" w16du:dateUtc="2026-10-12T16:56:00Z">
+        <w:r>
+          <w:t xml:space="preserve">The model makes estimates based on the data and associated sample sizes but cannot resolve which data source </w:t>
+        </w:r>
+      </w:ins>
+      <w:ins w:id="219" w:author="Joy, Philip J (DFG)" w:date="2026-10-12T08:57:00Z" w16du:dateUtc="2026-10-12T16:57:00Z">
+        <w:r>
+          <w:t xml:space="preserve">is more reliable. </w:t>
+        </w:r>
+      </w:ins>
+      <w:r>
+        <w:t>Area biologists should investigate this data discrepancy to determine if species identification or systematic under- or overreporting in logbooks is contributing to the contradictory data.</w:t>
       </w:r>
     </w:p>
     <w:p>
@@ -31614,22 +32864,22 @@
       <w:r>
         <w:t>This report provides the first harvest, release and mortality estimates for the BSAI and SOKO2SAP Kodiak CFMU’s</w:t>
       </w:r>
-      <w:ins w:id="62" w:author="Joy, Philip J (DFG)" w:date="2026-10-08T14:29:00Z" w16du:dateUtc="2026-10-08T22:29:00Z">
+      <w:ins w:id="220" w:author="Joy, Philip J (DFG)" w:date="2026-10-08T14:29:00Z" w16du:dateUtc="2026-10-08T22:29:00Z">
         <w:r>
           <w:t xml:space="preserve"> but estimates for unguided anglers </w:t>
         </w:r>
       </w:ins>
-      <w:ins w:id="63" w:author="Joy, Philip J (DFG)" w:date="2026-10-08T14:30:00Z" w16du:dateUtc="2026-10-08T22:30:00Z">
+      <w:ins w:id="221" w:author="Joy, Philip J (DFG)" w:date="2026-10-08T14:30:00Z" w16du:dateUtc="2026-10-08T22:30:00Z">
         <w:r>
           <w:t>lack precise and unbiased estimates from the SWHS as well as species</w:t>
         </w:r>
       </w:ins>
-      <w:ins w:id="64" w:author="Joy, Philip J (DFG)" w:date="2026-10-08T14:31:00Z" w16du:dateUtc="2026-10-08T22:31:00Z">
+      <w:ins w:id="222" w:author="Joy, Philip J (DFG)" w:date="2026-10-08T14:31:00Z" w16du:dateUtc="2026-10-08T22:31:00Z">
         <w:r>
           <w:t xml:space="preserve"> compositional and interview data</w:t>
         </w:r>
       </w:ins>
-      <w:ins w:id="65" w:author="Joy, Philip J (DFG)" w:date="2026-10-08T14:35:00Z" w16du:dateUtc="2026-10-08T22:35:00Z">
+      <w:ins w:id="223" w:author="Joy, Philip J (DFG)" w:date="2026-10-08T14:35:00Z" w16du:dateUtc="2026-10-08T22:35:00Z">
         <w:r>
           <w:t xml:space="preserve"> specific to those areas</w:t>
         </w:r>
@@ -31637,127 +32887,203 @@
       <w:r>
         <w:t xml:space="preserve">. </w:t>
       </w:r>
-      <w:ins w:id="66" w:author="Joy, Philip J (DFG)" w:date="2026-10-08T14:31:00Z" w16du:dateUtc="2026-10-08T22:31:00Z">
+      <w:ins w:id="224" w:author="Joy, Philip J (DFG)" w:date="2026-10-08T14:31:00Z" w16du:dateUtc="2026-10-08T22:31:00Z">
         <w:r>
           <w:t>As such, these estimates are dependent on the association with guided anglers in the region and relationships estimated from other areas in the Kodiak region and are t</w:t>
         </w:r>
       </w:ins>
-      <w:ins w:id="67" w:author="Joy, Philip J (DFG)" w:date="2026-10-08T14:32:00Z" w16du:dateUtc="2026-10-08T22:32:00Z">
+      <w:ins w:id="225" w:author="Joy, Philip J (DFG)" w:date="2026-10-08T14:32:00Z" w16du:dateUtc="2026-10-08T22:32:00Z">
         <w:r>
           <w:t xml:space="preserve">hus reliant on underlying model structure. </w:t>
         </w:r>
       </w:ins>
-      <w:ins w:id="68" w:author="Joy, Philip J (DFG)" w:date="2026-10-08T14:58:00Z" w16du:dateUtc="2026-10-08T22:58:00Z">
+      <w:ins w:id="226" w:author="Joy, Philip J (DFG)" w:date="2026-10-08T14:58:00Z" w16du:dateUtc="2026-10-08T22:58:00Z">
         <w:r>
           <w:t xml:space="preserve">This is particularly evident </w:t>
         </w:r>
       </w:ins>
-      <w:ins w:id="69" w:author="Joy, Philip J (DFG)" w:date="2026-10-08T14:59:00Z" w16du:dateUtc="2026-10-08T22:59:00Z">
+      <w:ins w:id="227" w:author="Joy, Philip J (DFG)" w:date="2026-10-08T14:59:00Z" w16du:dateUtc="2026-10-08T22:59:00Z">
         <w:r>
           <w:t xml:space="preserve">in the p_pelagic estimates </w:t>
         </w:r>
       </w:ins>
-      <w:ins w:id="70" w:author="Joy, Philip J (DFG)" w:date="2026-10-08T15:00:00Z" w16du:dateUtc="2026-10-08T23:00:00Z">
+      <w:ins w:id="228" w:author="Joy, Philip J (DFG)" w:date="2026-10-08T15:00:00Z" w16du:dateUtc="2026-10-08T23:00:00Z">
         <w:r>
           <w:t xml:space="preserve">(Figure P_PELAGIC) where there is a </w:t>
         </w:r>
       </w:ins>
-      <w:ins w:id="71" w:author="Joy, Philip J (DFG)" w:date="2026-10-08T15:01:00Z" w16du:dateUtc="2026-10-08T23:01:00Z">
+      <w:ins w:id="229" w:author="Joy, Philip J (DFG)" w:date="2026-10-08T15:01:00Z" w16du:dateUtc="2026-10-08T23:01:00Z">
         <w:r>
           <w:t>noticeable drop in the estimate between the historical model (1977-2019) and the contemporary portion of the model (2020-2025)</w:t>
         </w:r>
       </w:ins>
-      <w:ins w:id="72" w:author="Joy, Philip J (DFG)" w:date="2026-10-08T15:02:00Z" w16du:dateUtc="2026-10-08T23:02:00Z">
+      <w:ins w:id="230" w:author="Joy, Philip J (DFG)" w:date="2026-10-08T15:02:00Z" w16du:dateUtc="2026-10-08T23:02:00Z">
         <w:r>
-          <w:t xml:space="preserve"> that overlap in credibility intervals,</w:t>
+          <w:t xml:space="preserve"> that overlap in credibility intervals</w:t>
         </w:r>
       </w:ins>
-      <w:ins w:id="73" w:author="Joy, Philip J (DFG)" w:date="2026-10-08T15:03:00Z" w16du:dateUtc="2026-10-08T23:03:00Z">
-        <w:r>
-          <w:t xml:space="preserve"> but show the sensitivity to how the parameters are derived from other relationships in the model</w:t>
-        </w:r>
-      </w:ins>
-      <w:ins w:id="74" w:author="Joy, Philip J (DFG)" w:date="2026-10-08T15:00:00Z" w16du:dateUtc="2026-10-08T23:00:00Z">
+      <w:ins w:id="231" w:author="Joy, Philip J (DFG)" w:date="2026-10-08T15:00:00Z" w16du:dateUtc="2026-10-08T23:00:00Z">
         <w:r>
           <w:t>.</w:t>
         </w:r>
       </w:ins>
-      <w:ins w:id="75" w:author="Joy, Philip J (DFG)" w:date="2026-10-09T09:18:00Z" w16du:dateUtc="2026-10-09T17:18:00Z">
+      <w:ins w:id="232" w:author="Joy, Philip J (DFG)" w:date="2026-10-12T08:58:00Z" w16du:dateUtc="2026-10-12T16:58:00Z">
         <w:r>
           <w:t xml:space="preserve"> </w:t>
         </w:r>
       </w:ins>
-      <w:ins w:id="76" w:author="Joy, Philip J (DFG)" w:date="2026-10-09T09:19:00Z" w16du:dateUtc="2026-10-09T17:19:00Z">
+      <w:ins w:id="233" w:author="Joy, Philip J (DFG)" w:date="2026-10-12T08:59:00Z" w16du:dateUtc="2026-10-12T16:59:00Z">
         <w:r>
-          <w:t>[inflates estimates of yelloweye</w:t>
+          <w:t>Sensitivity testing during model development showed that th</w:t>
+        </w:r>
+        <w:r>
+          <w:t>is had minimal effect on estimates of black rockfish harvests because th</w:t>
         </w:r>
       </w:ins>
-      <w:ins w:id="77" w:author="Joy, Philip J (DFG)" w:date="2026-10-09T09:23:00Z" w16du:dateUtc="2026-10-09T17:23:00Z">
+      <w:ins w:id="234" w:author="Joy, Philip J (DFG)" w:date="2026-10-12T09:00:00Z" w16du:dateUtc="2026-10-12T17:00:00Z">
         <w:r>
-          <w:t xml:space="preserve"> and “other” to a lesser extent</w:t>
+          <w:t xml:space="preserve">ose estimates were underpinned by more informative data. However, the knock-on effect was that it did impact estimates of yelloweye removals </w:t>
         </w:r>
       </w:ins>
-      <w:ins w:id="78" w:author="Joy, Philip J (DFG)" w:date="2026-10-09T09:19:00Z" w16du:dateUtc="2026-10-09T17:19:00Z">
+      <w:ins w:id="235" w:author="Joy, Philip J (DFG)" w:date="2026-10-12T09:01:00Z" w16du:dateUtc="2026-10-12T17:01:00Z">
         <w:r>
-          <w:t xml:space="preserve"> but not brf…explain.</w:t>
+          <w:t xml:space="preserve">because there was minimal data on yelloweye from the logbook </w:t>
         </w:r>
       </w:ins>
-      <w:ins w:id="79" w:author="Joy, Philip J (DFG)" w:date="2026-10-09T09:26:00Z" w16du:dateUtc="2026-10-09T17:26:00Z">
+      <w:ins w:id="236" w:author="Joy, Philip J (DFG)" w:date="2026-10-12T09:02:00Z" w16du:dateUtc="2026-10-12T17:02:00Z">
         <w:r>
-          <w:t xml:space="preserve"> BRF harvests underpinned by logbook data</w:t>
+          <w:t>and port sampling data while SWHS estimates for these regions lack precision.</w:t>
         </w:r>
       </w:ins>
-      <w:ins w:id="80" w:author="Joy, Philip J (DFG)" w:date="2026-10-09T09:27:00Z" w16du:dateUtc="2026-10-09T17:27:00Z">
-        <w:r>
-          <w:t xml:space="preserve"> so stay consistent with alternative model formulation. BC other and ye only underpinned by imprecise and biased SWHS dat</w:t>
-        </w:r>
-      </w:ins>
-      <w:ins w:id="81" w:author="Joy, Philip J (DFG)" w:date="2026-10-09T09:28:00Z" w16du:dateUtc="2026-10-09T17:28:00Z">
-        <w:r>
-          <w:t>a and weak or lacking LB data those values change with how p_pelagic is estimated</w:t>
-        </w:r>
-      </w:ins>
-      <w:ins w:id="82" w:author="Joy, Philip J (DFG)" w:date="2026-10-09T09:30:00Z" w16du:dateUtc="2026-10-09T17:30:00Z">
-        <w:r>
-          <w:t xml:space="preserve">. BUT… fixing p_pelagic to hyoerprior estimated from rest of Kodiak results in </w:t>
-        </w:r>
-      </w:ins>
-      <w:ins w:id="83" w:author="Joy, Philip J (DFG)" w:date="2026-10-09T09:19:00Z" w16du:dateUtc="2026-10-09T17:19:00Z">
-        <w:r>
-          <w:t>]</w:t>
-        </w:r>
-      </w:ins>
-      <w:ins w:id="84" w:author="Joy, Philip J (DFG)" w:date="2026-10-08T15:00:00Z" w16du:dateUtc="2026-10-08T23:00:00Z">
+      <w:ins w:id="237" w:author="Joy, Philip J (DFG)" w:date="2026-10-12T09:01:00Z" w16du:dateUtc="2026-10-12T17:01:00Z">
         <w:r>
           <w:t xml:space="preserve"> </w:t>
         </w:r>
       </w:ins>
-      <w:ins w:id="85" w:author="Joy, Philip J (DFG)" w:date="2026-10-08T14:32:00Z" w16du:dateUtc="2026-10-08T22:32:00Z">
+      <w:ins w:id="238" w:author="Joy, Philip J (DFG)" w:date="2026-10-09T09:18:00Z" w16du:dateUtc="2026-10-09T17:18:00Z">
+        <w:r>
+          <w:t xml:space="preserve"> </w:t>
+        </w:r>
+      </w:ins>
+      <w:ins w:id="239" w:author="Joy, Philip J (DFG)" w:date="2026-10-09T09:19:00Z" w16du:dateUtc="2026-10-09T17:19:00Z">
+        <w:r>
+          <w:rPr>
+            <w:highlight w:val="yellow"/>
+            <w:rPrChange w:id="240" w:author="Joy, Philip J (DFG)" w:date="2026-10-12T09:02:00Z" w16du:dateUtc="2026-10-12T17:02:00Z">
+              <w:rPr/>
+            </w:rPrChange>
+          </w:rPr>
+          <w:t>[inflates estimates of yelloweye</w:t>
+        </w:r>
+      </w:ins>
+      <w:ins w:id="241" w:author="Joy, Philip J (DFG)" w:date="2026-10-09T09:23:00Z" w16du:dateUtc="2026-10-09T17:23:00Z">
+        <w:r>
+          <w:rPr>
+            <w:highlight w:val="yellow"/>
+            <w:rPrChange w:id="242" w:author="Joy, Philip J (DFG)" w:date="2026-10-12T09:02:00Z" w16du:dateUtc="2026-10-12T17:02:00Z">
+              <w:rPr/>
+            </w:rPrChange>
+          </w:rPr>
+          <w:t xml:space="preserve"> and “other” to a lesser extent</w:t>
+        </w:r>
+      </w:ins>
+      <w:ins w:id="243" w:author="Joy, Philip J (DFG)" w:date="2026-10-09T09:19:00Z" w16du:dateUtc="2026-10-09T17:19:00Z">
+        <w:r>
+          <w:rPr>
+            <w:highlight w:val="yellow"/>
+            <w:rPrChange w:id="244" w:author="Joy, Philip J (DFG)" w:date="2026-10-12T09:02:00Z" w16du:dateUtc="2026-10-12T17:02:00Z">
+              <w:rPr/>
+            </w:rPrChange>
+          </w:rPr>
+          <w:t xml:space="preserve"> but not brf…explain.</w:t>
+        </w:r>
+      </w:ins>
+      <w:ins w:id="245" w:author="Joy, Philip J (DFG)" w:date="2026-10-09T09:26:00Z" w16du:dateUtc="2026-10-09T17:26:00Z">
+        <w:r>
+          <w:rPr>
+            <w:highlight w:val="yellow"/>
+            <w:rPrChange w:id="246" w:author="Joy, Philip J (DFG)" w:date="2026-10-12T09:02:00Z" w16du:dateUtc="2026-10-12T17:02:00Z">
+              <w:rPr/>
+            </w:rPrChange>
+          </w:rPr>
+          <w:t xml:space="preserve"> BRF harvests underpinned by logbook data</w:t>
+        </w:r>
+      </w:ins>
+      <w:ins w:id="247" w:author="Joy, Philip J (DFG)" w:date="2026-10-09T09:27:00Z" w16du:dateUtc="2026-10-09T17:27:00Z">
+        <w:r>
+          <w:rPr>
+            <w:highlight w:val="yellow"/>
+            <w:rPrChange w:id="248" w:author="Joy, Philip J (DFG)" w:date="2026-10-12T09:02:00Z" w16du:dateUtc="2026-10-12T17:02:00Z">
+              <w:rPr/>
+            </w:rPrChange>
+          </w:rPr>
+          <w:t xml:space="preserve"> so stay consistent with alternative model formulation. BC other and ye only underpinned by imprecise and biased SWHS dat</w:t>
+        </w:r>
+      </w:ins>
+      <w:ins w:id="249" w:author="Joy, Philip J (DFG)" w:date="2026-10-09T09:28:00Z" w16du:dateUtc="2026-10-09T17:28:00Z">
+        <w:r>
+          <w:rPr>
+            <w:highlight w:val="yellow"/>
+            <w:rPrChange w:id="250" w:author="Joy, Philip J (DFG)" w:date="2026-10-12T09:02:00Z" w16du:dateUtc="2026-10-12T17:02:00Z">
+              <w:rPr/>
+            </w:rPrChange>
+          </w:rPr>
+          <w:t>a and weak or lacking LB data those values change with how p_pelagic is estimated</w:t>
+        </w:r>
+      </w:ins>
+      <w:ins w:id="251" w:author="Joy, Philip J (DFG)" w:date="2026-10-09T09:30:00Z" w16du:dateUtc="2026-10-09T17:30:00Z">
+        <w:r>
+          <w:rPr>
+            <w:highlight w:val="yellow"/>
+            <w:rPrChange w:id="252" w:author="Joy, Philip J (DFG)" w:date="2026-10-12T09:02:00Z" w16du:dateUtc="2026-10-12T17:02:00Z">
+              <w:rPr/>
+            </w:rPrChange>
+          </w:rPr>
+          <w:t xml:space="preserve">. BUT… fixing p_pelagic to hyoerprior estimated from rest of Kodiak results in </w:t>
+        </w:r>
+      </w:ins>
+      <w:ins w:id="253" w:author="Joy, Philip J (DFG)" w:date="2026-10-09T09:19:00Z" w16du:dateUtc="2026-10-09T17:19:00Z">
+        <w:r>
+          <w:rPr>
+            <w:highlight w:val="yellow"/>
+            <w:rPrChange w:id="254" w:author="Joy, Philip J (DFG)" w:date="2026-10-12T09:02:00Z" w16du:dateUtc="2026-10-12T17:02:00Z">
+              <w:rPr/>
+            </w:rPrChange>
+          </w:rPr>
+          <w:t>]</w:t>
+        </w:r>
+      </w:ins>
+      <w:ins w:id="255" w:author="Joy, Philip J (DFG)" w:date="2026-10-08T15:00:00Z" w16du:dateUtc="2026-10-08T23:00:00Z">
+        <w:r>
+          <w:t xml:space="preserve"> </w:t>
+        </w:r>
+      </w:ins>
+      <w:ins w:id="256" w:author="Joy, Philip J (DFG)" w:date="2026-10-08T14:32:00Z" w16du:dateUtc="2026-10-08T22:32:00Z">
         <w:r>
           <w:t xml:space="preserve">These estimates are likely to shift as </w:t>
         </w:r>
       </w:ins>
-      <w:ins w:id="86" w:author="Joy, Philip J (DFG)" w:date="2026-10-08T14:33:00Z" w16du:dateUtc="2026-10-08T22:33:00Z">
+      <w:ins w:id="257" w:author="Joy, Philip J (DFG)" w:date="2026-10-08T14:33:00Z" w16du:dateUtc="2026-10-08T22:33:00Z">
         <w:r>
           <w:t xml:space="preserve">data is added each year and </w:t>
         </w:r>
       </w:ins>
-      <w:ins w:id="87" w:author="Joy, Philip J (DFG)" w:date="2026-10-08T14:34:00Z" w16du:dateUtc="2026-10-08T22:34:00Z">
+      <w:ins w:id="258" w:author="Joy, Philip J (DFG)" w:date="2026-10-08T14:34:00Z" w16du:dateUtc="2026-10-08T22:34:00Z">
         <w:r>
           <w:t xml:space="preserve">will require monitoring </w:t>
         </w:r>
       </w:ins>
-      <w:ins w:id="88" w:author="Joy, Philip J (DFG)" w:date="2026-10-08T14:36:00Z" w16du:dateUtc="2026-10-08T22:36:00Z">
+      <w:ins w:id="259" w:author="Joy, Philip J (DFG)" w:date="2026-10-08T14:36:00Z" w16du:dateUtc="2026-10-08T22:36:00Z">
         <w:r>
           <w:t>as estimates are produced each year.</w:t>
         </w:r>
       </w:ins>
-      <w:ins w:id="89" w:author="Joy, Philip J (DFG)" w:date="2026-10-08T14:32:00Z" w16du:dateUtc="2026-10-08T22:32:00Z">
+      <w:ins w:id="260" w:author="Joy, Philip J (DFG)" w:date="2026-10-08T14:32:00Z" w16du:dateUtc="2026-10-08T22:32:00Z">
         <w:r>
           <w:t xml:space="preserve"> </w:t>
         </w:r>
       </w:ins>
-      <w:del w:id="90" w:author="Joy, Philip J (DFG)" w:date="2026-10-08T14:37:00Z" w16du:dateUtc="2026-10-08T22:37:00Z">
+      <w:del w:id="261" w:author="Joy, Philip J (DFG)" w:date="2026-10-08T14:37:00Z" w16du:dateUtc="2026-10-08T22:37:00Z">
         <w:r>
           <w:delText xml:space="preserve">Many of these estimates and associated parameters were the slowest to converge. </w:delText>
         </w:r>
@@ -31765,81 +33091,81 @@
       <w:r>
         <w:t xml:space="preserve">Nevertheless, trace plots show consistent exploration of the parameter space and estimates include large credibility intervals that reflect the lack of data from these areas. </w:t>
       </w:r>
-      <w:ins w:id="91" w:author="Joy, Philip J (DFG)" w:date="2026-10-08T15:04:00Z" w16du:dateUtc="2026-10-08T23:04:00Z">
+      <w:ins w:id="262" w:author="Joy, Philip J (DFG)" w:date="2026-10-08T15:04:00Z" w16du:dateUtc="2026-10-08T23:04:00Z">
         <w:r>
           <w:t xml:space="preserve">This is true even for the p_pelagic estimates where </w:t>
         </w:r>
       </w:ins>
-      <w:ins w:id="92" w:author="Joy, Philip J (DFG)" w:date="2026-10-08T15:05:00Z" w16du:dateUtc="2026-10-08T23:05:00Z">
+      <w:ins w:id="263" w:author="Joy, Philip J (DFG)" w:date="2026-10-08T15:05:00Z" w16du:dateUtc="2026-10-08T23:05:00Z">
         <w:r>
           <w:t xml:space="preserve">although the point estimates differ, both the historical and contemporary </w:t>
         </w:r>
       </w:ins>
-      <w:ins w:id="93" w:author="Joy, Philip J (DFG)" w:date="2026-10-08T15:06:00Z" w16du:dateUtc="2026-10-08T23:06:00Z">
+      <w:ins w:id="264" w:author="Joy, Philip J (DFG)" w:date="2026-10-08T15:06:00Z" w16du:dateUtc="2026-10-08T23:06:00Z">
         <w:r>
           <w:t xml:space="preserve">point </w:t>
         </w:r>
       </w:ins>
-      <w:ins w:id="94" w:author="Joy, Philip J (DFG)" w:date="2026-10-08T15:05:00Z" w16du:dateUtc="2026-10-08T23:05:00Z">
+      <w:ins w:id="265" w:author="Joy, Philip J (DFG)" w:date="2026-10-08T15:05:00Z" w16du:dateUtc="2026-10-08T23:05:00Z">
         <w:r>
           <w:t>estimate</w:t>
         </w:r>
       </w:ins>
-      <w:ins w:id="95" w:author="Joy, Philip J (DFG)" w:date="2026-10-08T15:06:00Z" w16du:dateUtc="2026-10-08T23:06:00Z">
+      <w:ins w:id="266" w:author="Joy, Philip J (DFG)" w:date="2026-10-08T15:06:00Z" w16du:dateUtc="2026-10-08T23:06:00Z">
         <w:r>
           <w:t>s</w:t>
         </w:r>
       </w:ins>
-      <w:ins w:id="96" w:author="Joy, Philip J (DFG)" w:date="2026-10-08T15:05:00Z" w16du:dateUtc="2026-10-08T23:05:00Z">
+      <w:ins w:id="267" w:author="Joy, Philip J (DFG)" w:date="2026-10-08T15:05:00Z" w16du:dateUtc="2026-10-08T23:05:00Z">
         <w:r>
           <w:t xml:space="preserve"> are well within the </w:t>
         </w:r>
       </w:ins>
-      <w:ins w:id="97" w:author="Joy, Philip J (DFG)" w:date="2026-10-08T15:06:00Z" w16du:dateUtc="2026-10-08T23:06:00Z">
+      <w:ins w:id="268" w:author="Joy, Philip J (DFG)" w:date="2026-10-08T15:06:00Z" w16du:dateUtc="2026-10-08T23:06:00Z">
         <w:r>
           <w:t xml:space="preserve">broad </w:t>
         </w:r>
       </w:ins>
-      <w:ins w:id="98" w:author="Joy, Philip J (DFG)" w:date="2026-10-08T15:05:00Z" w16du:dateUtc="2026-10-08T23:05:00Z">
+      <w:ins w:id="269" w:author="Joy, Philip J (DFG)" w:date="2026-10-08T15:05:00Z" w16du:dateUtc="2026-10-08T23:05:00Z">
         <w:r>
           <w:t xml:space="preserve">credibility intervals of </w:t>
         </w:r>
       </w:ins>
-      <w:ins w:id="99" w:author="Joy, Philip J (DFG)" w:date="2026-10-08T15:06:00Z" w16du:dateUtc="2026-10-08T23:06:00Z">
+      <w:ins w:id="270" w:author="Joy, Philip J (DFG)" w:date="2026-10-08T15:06:00Z" w16du:dateUtc="2026-10-08T23:06:00Z">
         <w:r>
           <w:t>both</w:t>
         </w:r>
       </w:ins>
-      <w:ins w:id="100" w:author="Joy, Philip J (DFG)" w:date="2026-10-08T15:05:00Z" w16du:dateUtc="2026-10-08T23:05:00Z">
+      <w:ins w:id="271" w:author="Joy, Philip J (DFG)" w:date="2026-10-08T15:05:00Z" w16du:dateUtc="2026-10-08T23:05:00Z">
         <w:r>
           <w:t xml:space="preserve">. </w:t>
         </w:r>
       </w:ins>
       <w:r>
-        <w:t xml:space="preserve">The hierarchical nature of the model allows inferences to be made based on data </w:t>
-      </w:r>
-      <w:r>
-        <w:lastRenderedPageBreak/>
-        <w:t>from the rest of the Kodiak region and these estimates provide managers with reasonable, if imprecise, information about the scale and trend of rockfish harvests in these areas.</w:t>
+        <w:t>The hierarchical nature of the model allows inferences to be made based on data from the rest of the Kodiak region and these estimates provide managers with reasonable, if imprecise, information about the scale and trend of rockfish harvests in these areas.</w:t>
       </w:r>
     </w:p>
     <w:p>
       <w:pPr>
         <w:pStyle w:val="Heading2"/>
       </w:pPr>
-      <w:bookmarkStart w:id="101" w:name="_Toc242361803"/>
-      <w:bookmarkStart w:id="102" w:name="conclusions-and-recommendations"/>
+      <w:bookmarkStart w:id="272" w:name="_Toc242361803"/>
+      <w:bookmarkStart w:id="273" w:name="conclusions-and-recommendations"/>
       <w:r>
         <w:t>Conclusions and Recommendations</w:t>
       </w:r>
-      <w:bookmarkEnd w:id="101"/>
+      <w:bookmarkEnd w:id="272"/>
     </w:p>
     <w:p>
       <w:pPr>
         <w:pStyle w:val="FirstParagraph"/>
       </w:pPr>
       <w:r>
-        <w:t>Managers understandably prefer harvest estimates to remain static once published yet removals occuring in sport fisheries are estimated quantities that can change with improved science reflecting our understanding of the system. Adopting new harvest and release estimates is ultimately at the discretion of regional staff and managers. These revisions were made to address shortcomings in the original Howard methods which provided the first steps in estimating rockfish harvests from the various data sources used to monitor sport harvests in Alaska. The new estimates represent a more uniform and reproducible approach to generating removal estimates, extend the time series back to 1977 and furthermore provide a robust and more streamlined approach to generating estimates going forward.</w:t>
+        <w:t xml:space="preserve">Managers understandably prefer harvest estimates to remain static once published yet removals occuring in sport fisheries are estimated quantities that can change with improved science reflecting our understanding of the system. Adopting new harvest and release estimates is ultimately at the discretion of regional staff and managers. These revisions were made to address shortcomings in the original Howard methods which provided the first steps in estimating rockfish harvests from the various data sources used to monitor sport harvests in Alaska. The new estimates represent a more uniform and reproducible approach to generating removal estimates, extend the </w:t>
+      </w:r>
+      <w:r>
+        <w:lastRenderedPageBreak/>
+        <w:t>time series back to 1977 and furthermore provide a robust and more streamlined approach to generating estimates going forward.</w:t>
       </w:r>
     </w:p>
     <w:p>
@@ -31855,7 +33181,15 @@
         <w:pStyle w:val="BodyText"/>
       </w:pPr>
       <w:r>
-        <w:t xml:space="preserve">One caveat to moving forward with these methods is the the possibility of gaps occurring in the port sampling programs. The modern period of the model calculates the </w:t>
+        <w:t xml:space="preserve">One caveat to moving forward with these methods is the </w:t>
+      </w:r>
+      <w:del w:id="274" w:author="Joy, Philip J (DFG)" w:date="2026-10-12T09:03:00Z" w16du:dateUtc="2026-10-12T17:03:00Z">
+        <w:r>
+          <w:delText xml:space="preserve">the </w:delText>
+        </w:r>
+      </w:del>
+      <w:r>
+        <w:t xml:space="preserve">possibility of gaps occurring in the port sampling programs. The modern period of the model calculates the </w:t>
       </w:r>
       <w:r>
         <w:rPr>
@@ -31910,38 +33244,35 @@
       <w:pPr>
         <w:pStyle w:val="Heading1"/>
       </w:pPr>
-      <w:bookmarkStart w:id="103" w:name="_Toc242361804"/>
-      <w:bookmarkStart w:id="104" w:name="acknowledgments"/>
-      <w:bookmarkEnd w:id="61"/>
-      <w:bookmarkEnd w:id="102"/>
+      <w:bookmarkStart w:id="275" w:name="_Toc242361804"/>
+      <w:bookmarkStart w:id="276" w:name="acknowledgments"/>
+      <w:bookmarkEnd w:id="205"/>
+      <w:bookmarkEnd w:id="273"/>
       <w:r>
         <w:t>Acknowledgments</w:t>
       </w:r>
-      <w:bookmarkEnd w:id="103"/>
+      <w:bookmarkEnd w:id="275"/>
     </w:p>
     <w:p>
       <w:pPr>
         <w:pStyle w:val="FirstParagraph"/>
       </w:pPr>
       <w:r>
-        <w:t xml:space="preserve">Sport harvest reconstructions provided in this document were made possible by the devoted time and effort of many people administering the data collection projects used in these analyses. First and foremost, it needs to be acknowledged that although this report may seem critical of the Howard methods, this effort does not exist without the foundational work undertaken by Katie Howard and her coauthors in developing these methods, establishing and validating the relevancy </w:t>
-      </w:r>
-      <w:r>
-        <w:lastRenderedPageBreak/>
-        <w:t>of the data, and developing a system of accurately assigning data to appropriate CFMUs that are now available annually from the SWHS and logbook programs. Similarly, those overseeing and running those programs deserve special thanks for the high quality work and products produced including Nick Smith and Jacob Bozzini from the SWHS program and Ben Jevons and Kyla Buster from the Saltwater Guide Logbook program. This project also highlights the high value of the port sampling programs with particular thanks going to Marian Ford, Corey Litwiniak, Adam Lake, and a virtual army of technicians. We would also like to thank Tyler Polum and Philip Tschersich for the Kodiak hydroacoustic data and advice. We would like to thank Adam Reimer for developing the initial approach to this model and Hamachan Hamazaki for his review of this work.</w:t>
+        <w:t>Sport harvest reconstructions provided in this document were made possible by the devoted time and effort of many people administering the data collection projects used in these analyses. First and foremost, it needs to be acknowledged that although this report may seem critical of the Howard methods, this effort does not exist without the foundational work undertaken by Katie Howard and her coauthors in developing these methods, establishing and validating the relevancy of the data, and developing a system of accurately assigning data to appropriate CFMUs that are now available annually from the SWHS and logbook programs. Similarly, those overseeing and running those programs deserve special thanks for the high quality work and products produced including Nick Smith and Jacob Bozzini from the SWHS program and Ben Jevons and Kyla Buster from the Saltwater Guide Logbook program. This project also highlights the high value of the port sampling programs with particular thanks going to Marian Ford, Corey Litwiniak, Adam Lake, and a virtual army of technicians. We would also like to thank Tyler Polum and Philip Tschersich for the Kodiak hydroacoustic data and advice. We would like to thank Adam Reimer for developing the initial approach to this model and Hamachan Hamazaki for his review of this work.</w:t>
       </w:r>
     </w:p>
     <w:p>
       <w:pPr>
         <w:pStyle w:val="Heading1"/>
       </w:pPr>
-      <w:bookmarkStart w:id="105" w:name="_Toc242361805"/>
-      <w:bookmarkStart w:id="106" w:name="literature-cited"/>
-      <w:bookmarkEnd w:id="104"/>
-      <w:r>
+      <w:bookmarkStart w:id="277" w:name="_Toc242361805"/>
+      <w:bookmarkStart w:id="278" w:name="literature-cited"/>
+      <w:bookmarkEnd w:id="276"/>
+      <w:r>
+        <w:lastRenderedPageBreak/>
         <w:t>Literature Cited</w:t>
       </w:r>
-      <w:bookmarkEnd w:id="105"/>
+      <w:bookmarkEnd w:id="277"/>
     </w:p>
     <w:p>
       <w:pPr>
@@ -32044,7 +33375,6 @@
         <w:pStyle w:val="BodyText"/>
       </w:pPr>
       <w:r>
-        <w:lastRenderedPageBreak/>
         <w:t>Hochhalter, S. J., and D. J. Reed. 2011. The effectiveness of deepwater release at improving the survival of discarded yelloweye rockfish. North American Journal of Fisheries Management 31: 852-860.</w:t>
       </w:r>
     </w:p>
@@ -32061,6 +33391,7 @@
         <w:pStyle w:val="BodyText"/>
       </w:pPr>
       <w:r>
+        <w:lastRenderedPageBreak/>
         <w:t>Howard, K. G., D. Evans, and A. St. Saviour. 2020. Reconstructed sport harvests and releases of black and yelloweye rockfishes in the Gulf of Alaska, 1998–2018. Alaska Department of Fish and Game, Fishery Data Series No. 20-25, Anchorage.</w:t>
       </w:r>
     </w:p>
@@ -32204,7 +33535,6 @@
         <w:pStyle w:val="BodyText"/>
       </w:pPr>
       <w:r>
-        <w:lastRenderedPageBreak/>
         <w:t xml:space="preserve">R Core Team (2021). R: A language and environment for statistical computing. R Foundation for Statistical Computing, Vienna, Austria. URL </w:t>
       </w:r>
       <w:hyperlink r:id="rId10">
@@ -32240,6 +33570,7 @@
         <w:pStyle w:val="BodyText"/>
       </w:pPr>
       <w:r>
+        <w:lastRenderedPageBreak/>
         <w:t>Ruppert, David, Matt P. Wand, and Raymond J. Carroll. 2003. Semiparametric Regression. Cambridge University Press.</w:t>
       </w:r>
     </w:p>
@@ -32268,7 +33599,7 @@
       <w:pPr>
         <w:pStyle w:val="Heading4"/>
       </w:pPr>
-      <w:bookmarkStart w:id="107" w:name="extra-stuff-not-ready-to-delete"/>
+      <w:bookmarkStart w:id="279" w:name="extra-stuff-not-ready-to-delete"/>
       <w:r>
         <w:lastRenderedPageBreak/>
         <w:t>Extra Stuff not ready to delete:</w:t>
@@ -33558,8 +34889,8 @@
           </m:sSup>
         </m:oMath>
       </m:oMathPara>
-      <w:bookmarkEnd w:id="106"/>
-      <w:bookmarkEnd w:id="107"/>
+      <w:bookmarkEnd w:id="278"/>
+      <w:bookmarkEnd w:id="279"/>
     </w:p>
     <w:sectPr>
       <w:footerReference w:type="default" r:id="rId11"/>

</xml_diff>